<commit_message>
Fix four consistency errors found in review
The Foster lab had two names: the CV called it Foster System Database while
the résumé and the site both said Foster Care Policy Database. The CV was the
outlier, so it takes the other two.

"silicon spin qubit" was unhyphenated in three prose places — the résumé
tagline, the site's meta description, and the site intro — while every other
instance says spin-qubit. The thesis title keeps its own capitalisation.

The site tagged the adiabatic project "Trotter–Suzuki". The paper it links says
Suzuki–Trotter.

The SIEM figure read "over 1 TB/day" on the résumé and "1+ TB/day" on the CV.
One rendering now.

Co-Authored-By: Claude Opus 5 <noreply@anthropic.com>
Claude-Session: https://claude.ai/code/session_01EbsTbSDgvxSSfAYTVqmk9g
</commit_message>
<xml_diff>
--- a/resume/jaspersands_resume.docx
+++ b/resume/jaspersands_resume.docx
@@ -32,7 +32,7 @@
         </w:rPr>
         <w:t xml:space="preserve">Palo Alto, CA | +1 (650) 924-8429 | </w:t>
       </w:r>
-      <w:hyperlink w:history="1" r:id="rIdcnwbhafyjq485n_ix48do">
+      <w:hyperlink w:history="1" r:id="rId6wg6s2jdyxhoekl10gjb-">
         <w:r>
           <w:rPr>
             <w:rFonts w:ascii="Times New Roman" w:cs="Times New Roman" w:eastAsia="Times New Roman" w:hAnsi="Times New Roman"/>
@@ -50,7 +50,7 @@
         </w:rPr>
         <w:t xml:space="preserve"> | </w:t>
       </w:r>
-      <w:hyperlink w:history="1" r:id="rIdh6rmrrldzkvtvyihec6ys">
+      <w:hyperlink w:history="1" r:id="rIdnabadk-fhdy2_at1vh9ts">
         <w:r>
           <w:rPr>
             <w:rFonts w:ascii="Times New Roman" w:cs="Times New Roman" w:eastAsia="Times New Roman" w:hAnsi="Times New Roman"/>
@@ -68,7 +68,7 @@
         </w:rPr>
         <w:t xml:space="preserve"> | </w:t>
       </w:r>
-      <w:hyperlink w:history="1" r:id="rIdpvnddofskjlihnwx0pi_8">
+      <w:hyperlink w:history="1" r:id="rId5eq1rg5w_vbo6mza68vjl">
         <w:r>
           <w:rPr>
             <w:rFonts w:ascii="Times New Roman" w:cs="Times New Roman" w:eastAsia="Times New Roman" w:hAnsi="Times New Roman"/>
@@ -86,7 +86,7 @@
         </w:rPr>
         <w:t xml:space="preserve"> | </w:t>
       </w:r>
-      <w:hyperlink w:history="1" r:id="rIdwvbxf1azdgdp2tblxqswr">
+      <w:hyperlink w:history="1" r:id="rIdunemyim9qb_anx140umhi">
         <w:r>
           <w:rPr>
             <w:rFonts w:ascii="Times New Roman" w:cs="Times New Roman" w:eastAsia="Times New Roman" w:hAnsi="Times New Roman"/>
@@ -429,7 +429,7 @@
         </w:tabs>
         <w:spacing w:before="42" w:line="235" w:lineRule="exact"/>
       </w:pPr>
-      <w:hyperlink w:history="1" r:id="rIdz7l1il2sqbxtjzefnla9t">
+      <w:hyperlink w:history="1" r:id="rIdews8akq00fn14dwxzhi6b">
         <w:r>
           <w:rPr>
             <w:rFonts w:ascii="Times New Roman" w:cs="Times New Roman" w:eastAsia="Times New Roman" w:hAnsi="Times New Roman"/>
@@ -522,7 +522,7 @@
         </w:tabs>
         <w:spacing w:before="54" w:line="235" w:lineRule="exact"/>
       </w:pPr>
-      <w:hyperlink w:history="1" r:id="rIdrqlzw2w5ppo5dvbctjgqf">
+      <w:hyperlink w:history="1" r:id="rIdjoueruxhwzqc-f1bej1aw">
         <w:r>
           <w:rPr>
             <w:rFonts w:ascii="Times New Roman" w:cs="Times New Roman" w:eastAsia="Times New Roman" w:hAnsi="Times New Roman"/>
@@ -563,7 +563,7 @@
       <w:r>
         <w:tab/>
       </w:r>
-      <w:hyperlink w:history="1" r:id="rIdot2qgja0djfti3kyhr_ys">
+      <w:hyperlink w:history="1" r:id="rIdd-lo6fttqrzdmol5-lekh">
         <w:r>
           <w:rPr>
             <w:rFonts w:ascii="Times New Roman" w:cs="Times New Roman" w:eastAsia="Times New Roman" w:hAnsi="Times New Roman"/>
@@ -617,7 +617,7 @@
         </w:tabs>
         <w:spacing w:before="54" w:line="235" w:lineRule="exact"/>
       </w:pPr>
-      <w:hyperlink w:history="1" r:id="rIdkl3u2j7ukhavfbdlqctwc">
+      <w:hyperlink w:history="1" r:id="rIdzu324zdwugu3njjxxpedj">
         <w:r>
           <w:rPr>
             <w:rFonts w:ascii="Times New Roman" w:cs="Times New Roman" w:eastAsia="Times New Roman" w:hAnsi="Times New Roman"/>
@@ -640,7 +640,7 @@
       <w:r>
         <w:tab/>
       </w:r>
-      <w:hyperlink w:history="1" r:id="rId2a9sjqrdk2huiktvdic9z">
+      <w:hyperlink w:history="1" r:id="rIdkoylcdqkpf7zgzo6uvm03">
         <w:r>
           <w:rPr>
             <w:rFonts w:ascii="Times New Roman" w:cs="Times New Roman" w:eastAsia="Times New Roman" w:hAnsi="Times New Roman"/>
@@ -694,7 +694,7 @@
         </w:tabs>
         <w:spacing w:before="54" w:line="235" w:lineRule="exact"/>
       </w:pPr>
-      <w:hyperlink w:history="1" r:id="rIdo-tmoaxu03iducp-s_0f7">
+      <w:hyperlink w:history="1" r:id="rIdlv493rncres4t_1impx4e">
         <w:r>
           <w:rPr>
             <w:rFonts w:ascii="Times New Roman" w:cs="Times New Roman" w:eastAsia="Times New Roman" w:hAnsi="Times New Roman"/>
@@ -727,7 +727,7 @@
       <w:r>
         <w:tab/>
       </w:r>
-      <w:hyperlink w:history="1" r:id="rIdejpu1l-ndofpyl78nnbb9">
+      <w:hyperlink w:history="1" r:id="rIdutr8nfoulsf8p7s0djk4l">
         <w:r>
           <w:rPr>
             <w:rFonts w:ascii="Times New Roman" w:cs="Times New Roman" w:eastAsia="Times New Roman" w:hAnsi="Times New Roman"/>

</xml_diff>

<commit_message>
Fold the NYU place into the iQuHACK entry, restore Q-Search's second bullet
"qualified for" runs on from the iQuHACK result, unbolded, so it reads as part
of that entry rather than as its own award. The CV folds its separate Qualified
bullet into the same line at no cost in height: two lines either way. The site
says the same, in its own first person.

Q-Search has both bullets again on the two-page cut. They were merged into one
to pay for the teaching bullets; collapsing teaching to a single line gave the
room back, so the 720+ theorem modules and the permanent negative-result index
return.

Résumé one page at 99.1%, CV two pages at 96% and 95%.

Co-Authored-By: Claude Opus 5 <noreply@anthropic.com>
Claude-Session: https://claude.ai/code/session_01EbsTbSDgvxSSfAYTVqmk9g
</commit_message>
<xml_diff>
--- a/resume/jaspersands_resume.docx
+++ b/resume/jaspersands_resume.docx
@@ -32,7 +32,7 @@
         </w:rPr>
         <w:t xml:space="preserve">Palo Alto, CA | +1 (650) 924-8429 | </w:t>
       </w:r>
-      <w:hyperlink w:history="1" r:id="rId8kfqdfkihm7hzvktrrxkz">
+      <w:hyperlink w:history="1" r:id="rIdidgghvlsqlzl3vulwnf8n">
         <w:r>
           <w:rPr>
             <w:rFonts w:ascii="Times New Roman" w:cs="Times New Roman" w:eastAsia="Times New Roman" w:hAnsi="Times New Roman"/>
@@ -50,7 +50,7 @@
         </w:rPr>
         <w:t xml:space="preserve"> | </w:t>
       </w:r>
-      <w:hyperlink w:history="1" r:id="rIdt7yi574fibkcq76yp_1tc">
+      <w:hyperlink w:history="1" r:id="rIdkmw_ncbanzi9ryvvyse9a">
         <w:r>
           <w:rPr>
             <w:rFonts w:ascii="Times New Roman" w:cs="Times New Roman" w:eastAsia="Times New Roman" w:hAnsi="Times New Roman"/>
@@ -68,7 +68,7 @@
         </w:rPr>
         <w:t xml:space="preserve"> | </w:t>
       </w:r>
-      <w:hyperlink w:history="1" r:id="rIdmrikvluli2dfljv8eie9j">
+      <w:hyperlink w:history="1" r:id="rId_tin4hxamhgeqcio5v_wx">
         <w:r>
           <w:rPr>
             <w:rFonts w:ascii="Times New Roman" w:cs="Times New Roman" w:eastAsia="Times New Roman" w:hAnsi="Times New Roman"/>
@@ -86,7 +86,7 @@
         </w:rPr>
         <w:t xml:space="preserve"> | </w:t>
       </w:r>
-      <w:hyperlink w:history="1" r:id="rIdid9d4bs3bh4cnyyxssoam">
+      <w:hyperlink w:history="1" r:id="rId18ucnucguozcvn7shc5gi">
         <w:r>
           <w:rPr>
             <w:rFonts w:ascii="Times New Roman" w:cs="Times New Roman" w:eastAsia="Times New Roman" w:hAnsi="Times New Roman"/>
@@ -429,7 +429,7 @@
         </w:tabs>
         <w:spacing w:before="0" w:line="235" w:lineRule="exact"/>
       </w:pPr>
-      <w:hyperlink w:history="1" r:id="rIdhn8iirgzmeobgytuxp2e3">
+      <w:hyperlink w:history="1" r:id="rIdkrxj40tja8n4z3byrkxqc">
         <w:r>
           <w:rPr>
             <w:rFonts w:ascii="Times New Roman" w:cs="Times New Roman" w:eastAsia="Times New Roman" w:hAnsi="Times New Roman"/>
@@ -522,7 +522,7 @@
         </w:tabs>
         <w:spacing w:before="54" w:line="235" w:lineRule="exact"/>
       </w:pPr>
-      <w:hyperlink w:history="1" r:id="rId4xanjkgwsatwpuz-0jetk">
+      <w:hyperlink w:history="1" r:id="rIdqcc6zugkipr4ajqgoo3u9">
         <w:r>
           <w:rPr>
             <w:rFonts w:ascii="Times New Roman" w:cs="Times New Roman" w:eastAsia="Times New Roman" w:hAnsi="Times New Roman"/>
@@ -563,7 +563,7 @@
       <w:r>
         <w:tab/>
       </w:r>
-      <w:hyperlink w:history="1" r:id="rIdoi-lx37je-jh1bxvasocg">
+      <w:hyperlink w:history="1" r:id="rIdfpnjeqfsqi_uvaay2pacs">
         <w:r>
           <w:rPr>
             <w:rFonts w:ascii="Times New Roman" w:cs="Times New Roman" w:eastAsia="Times New Roman" w:hAnsi="Times New Roman"/>
@@ -617,7 +617,7 @@
         </w:tabs>
         <w:spacing w:before="54" w:line="235" w:lineRule="exact"/>
       </w:pPr>
-      <w:hyperlink w:history="1" r:id="rIdz3zu4v0dmlzt-b6h2qwax">
+      <w:hyperlink w:history="1" r:id="rIdis3pynkp9hnn9qkpc_v7x">
         <w:r>
           <w:rPr>
             <w:rFonts w:ascii="Times New Roman" w:cs="Times New Roman" w:eastAsia="Times New Roman" w:hAnsi="Times New Roman"/>
@@ -640,7 +640,7 @@
       <w:r>
         <w:tab/>
       </w:r>
-      <w:hyperlink w:history="1" r:id="rIdvj_ttfnvja-lbpdonmaak">
+      <w:hyperlink w:history="1" r:id="rId8xxvsbqsmdygebtl0evs3">
         <w:r>
           <w:rPr>
             <w:rFonts w:ascii="Times New Roman" w:cs="Times New Roman" w:eastAsia="Times New Roman" w:hAnsi="Times New Roman"/>
@@ -694,7 +694,7 @@
         </w:tabs>
         <w:spacing w:before="54" w:line="235" w:lineRule="exact"/>
       </w:pPr>
-      <w:hyperlink w:history="1" r:id="rIda9tybzy1fohoucqbcbznh">
+      <w:hyperlink w:history="1" r:id="rIdjhsc93ujxysyloa1yi3nk">
         <w:r>
           <w:rPr>
             <w:rFonts w:ascii="Times New Roman" w:cs="Times New Roman" w:eastAsia="Times New Roman" w:hAnsi="Times New Roman"/>
@@ -727,7 +727,7 @@
       <w:r>
         <w:tab/>
       </w:r>
-      <w:hyperlink w:history="1" r:id="rIdppfqv0nl5ag31x3qvmuex">
+      <w:hyperlink w:history="1" r:id="rIdd6m0k-lma_fmtwxdwaenm">
         <w:r>
           <w:rPr>
             <w:rFonts w:ascii="Times New Roman" w:cs="Times New Roman" w:eastAsia="Times New Roman" w:hAnsi="Times New Roman"/>
@@ -1389,7 +1389,7 @@
           <w:sz w:val="20"/>
           <w:szCs w:val="20"/>
         </w:rPr>
-        <w:t xml:space="preserve">, MIT iQuHACK 2026, qualifying for the NYU Abu Dhabi Quantum and AI Hackathon 2027</w:t>
+        <w:t xml:space="preserve">, MIT iQuHACK 2026, qualified for the NYU Abu Dhabi Quantum and AI Hackathon 2027</w:t>
       </w:r>
       <w:r>
         <w:rPr>

</xml_diff>

<commit_message>
Say "built and expanded" the simulation, not "built" it
"Built physics and sensor simulation" claimed the thing was started from
nothing. A lot of it was his, but not the foundation, so all four sources now
say built and expanded: the site, the résumé, both CV variants, and the .docx.

The knowledge-graph clause then read "expanded ... to expand", so the second
verb is "widen".

Résumé still one page at 99.1%, CV two pages at 96% and 95%.
</commit_message>
<xml_diff>
--- a/resume/jaspersands_resume.docx
+++ b/resume/jaspersands_resume.docx
@@ -32,7 +32,7 @@
         </w:rPr>
         <w:t xml:space="preserve">Palo Alto, CA | +1 (650) 924-8429 | </w:t>
       </w:r>
-      <w:hyperlink w:history="1" r:id="rIdidgghvlsqlzl3vulwnf8n">
+      <w:hyperlink w:history="1" r:id="rIdbubdgga_a53gtamh8c5u_">
         <w:r>
           <w:rPr>
             <w:rFonts w:ascii="Times New Roman" w:cs="Times New Roman" w:eastAsia="Times New Roman" w:hAnsi="Times New Roman"/>
@@ -50,7 +50,7 @@
         </w:rPr>
         <w:t xml:space="preserve"> | </w:t>
       </w:r>
-      <w:hyperlink w:history="1" r:id="rIdkmw_ncbanzi9ryvvyse9a">
+      <w:hyperlink w:history="1" r:id="rIdgo3lhjolegemuhok6qucf">
         <w:r>
           <w:rPr>
             <w:rFonts w:ascii="Times New Roman" w:cs="Times New Roman" w:eastAsia="Times New Roman" w:hAnsi="Times New Roman"/>
@@ -68,7 +68,7 @@
         </w:rPr>
         <w:t xml:space="preserve"> | </w:t>
       </w:r>
-      <w:hyperlink w:history="1" r:id="rId_tin4hxamhgeqcio5v_wx">
+      <w:hyperlink w:history="1" r:id="rIdqoqufoqeaqt9r3bfdqvge">
         <w:r>
           <w:rPr>
             <w:rFonts w:ascii="Times New Roman" w:cs="Times New Roman" w:eastAsia="Times New Roman" w:hAnsi="Times New Roman"/>
@@ -86,7 +86,7 @@
         </w:rPr>
         <w:t xml:space="preserve"> | </w:t>
       </w:r>
-      <w:hyperlink w:history="1" r:id="rId18ucnucguozcvn7shc5gi">
+      <w:hyperlink w:history="1" r:id="rIdb8zhyvp038ls8tyz2vhaf">
         <w:r>
           <w:rPr>
             <w:rFonts w:ascii="Times New Roman" w:cs="Times New Roman" w:eastAsia="Times New Roman" w:hAnsi="Times New Roman"/>
@@ -429,7 +429,7 @@
         </w:tabs>
         <w:spacing w:before="0" w:line="235" w:lineRule="exact"/>
       </w:pPr>
-      <w:hyperlink w:history="1" r:id="rIdkrxj40tja8n4z3byrkxqc">
+      <w:hyperlink w:history="1" r:id="rIdtqa8twhkmib-0rqngdegi">
         <w:r>
           <w:rPr>
             <w:rFonts w:ascii="Times New Roman" w:cs="Times New Roman" w:eastAsia="Times New Roman" w:hAnsi="Times New Roman"/>
@@ -522,7 +522,7 @@
         </w:tabs>
         <w:spacing w:before="54" w:line="235" w:lineRule="exact"/>
       </w:pPr>
-      <w:hyperlink w:history="1" r:id="rIdqcc6zugkipr4ajqgoo3u9">
+      <w:hyperlink w:history="1" r:id="rIdi3-ypillxwxmflwlx8zji">
         <w:r>
           <w:rPr>
             <w:rFonts w:ascii="Times New Roman" w:cs="Times New Roman" w:eastAsia="Times New Roman" w:hAnsi="Times New Roman"/>
@@ -563,7 +563,7 @@
       <w:r>
         <w:tab/>
       </w:r>
-      <w:hyperlink w:history="1" r:id="rIdfpnjeqfsqi_uvaay2pacs">
+      <w:hyperlink w:history="1" r:id="rIdyspnq7oaznxxexk8fkxu-">
         <w:r>
           <w:rPr>
             <w:rFonts w:ascii="Times New Roman" w:cs="Times New Roman" w:eastAsia="Times New Roman" w:hAnsi="Times New Roman"/>
@@ -617,7 +617,7 @@
         </w:tabs>
         <w:spacing w:before="54" w:line="235" w:lineRule="exact"/>
       </w:pPr>
-      <w:hyperlink w:history="1" r:id="rIdis3pynkp9hnn9qkpc_v7x">
+      <w:hyperlink w:history="1" r:id="rIdcfrigocshxsd5kohaalet">
         <w:r>
           <w:rPr>
             <w:rFonts w:ascii="Times New Roman" w:cs="Times New Roman" w:eastAsia="Times New Roman" w:hAnsi="Times New Roman"/>
@@ -640,7 +640,7 @@
       <w:r>
         <w:tab/>
       </w:r>
-      <w:hyperlink w:history="1" r:id="rId8xxvsbqsmdygebtl0evs3">
+      <w:hyperlink w:history="1" r:id="rId0vq5mjfmzg78ivgxmugpt">
         <w:r>
           <w:rPr>
             <w:rFonts w:ascii="Times New Roman" w:cs="Times New Roman" w:eastAsia="Times New Roman" w:hAnsi="Times New Roman"/>
@@ -694,7 +694,7 @@
         </w:tabs>
         <w:spacing w:before="54" w:line="235" w:lineRule="exact"/>
       </w:pPr>
-      <w:hyperlink w:history="1" r:id="rIdjhsc93ujxysyloa1yi3nk">
+      <w:hyperlink w:history="1" r:id="rIdd71-jrdhikmc6t-2h3ppz">
         <w:r>
           <w:rPr>
             <w:rFonts w:ascii="Times New Roman" w:cs="Times New Roman" w:eastAsia="Times New Roman" w:hAnsi="Times New Roman"/>
@@ -727,7 +727,7 @@
       <w:r>
         <w:tab/>
       </w:r>
-      <w:hyperlink w:history="1" r:id="rIdd6m0k-lma_fmtwxdwaenm">
+      <w:hyperlink w:history="1" r:id="rIdy2uglgkskag35jw8_qipq">
         <w:r>
           <w:rPr>
             <w:rFonts w:ascii="Times New Roman" w:cs="Times New Roman" w:eastAsia="Times New Roman" w:hAnsi="Times New Roman"/>
@@ -1158,7 +1158,7 @@
           <w:sz w:val="20"/>
           <w:szCs w:val="20"/>
         </w:rPr>
-        <w:t xml:space="preserve">Built physics and sensor simulation, integrating the knowledge graph to expand corpus generation.</w:t>
+        <w:t xml:space="preserve">Built and expanded physics and sensor simulation, integrating the knowledge graph to widen corpus generation.</w:t>
       </w:r>
     </w:p>
     <w:p>

</xml_diff>

<commit_message>
Résumé: ft-algorithms in place of LLM compression, stabilizer-qec rewritten
Projects are now stabilizer-qec (circuit-level decoders, gross code, Willow and
Sycamore data), ft-algorithms (new), Q-Search, WhatTheDuck. LLM compression stays on
the CV-free website and its own page. Summary names fault-tolerant algorithms; QEC
skills add lattice surgery. Cidon and Highnote bullets shortened to keep one page.

Co-Authored-By: Claude Opus 5.5 <noreply@anthropic.com>
Claude-Session: https://claude.ai/code/session_01B1JoCfzmbRMHJEkBTWzRWk
</commit_message>
<xml_diff>
--- a/resume/jaspersands_resume.docx
+++ b/resume/jaspersands_resume.docx
@@ -32,7 +32,7 @@
         </w:rPr>
         <w:t xml:space="preserve">Palo Alto, CA | +1 (650) 924-8429 | </w:t>
       </w:r>
-      <w:hyperlink w:history="1" r:id="rIdidgghvlsqlzl3vulwnf8n">
+      <w:hyperlink w:history="1" r:id="rIdldwvqwpzrf0uixmu95unn">
         <w:r>
           <w:rPr>
             <w:rFonts w:ascii="Times New Roman" w:cs="Times New Roman" w:eastAsia="Times New Roman" w:hAnsi="Times New Roman"/>
@@ -50,7 +50,7 @@
         </w:rPr>
         <w:t xml:space="preserve"> | </w:t>
       </w:r>
-      <w:hyperlink w:history="1" r:id="rIdkmw_ncbanzi9ryvvyse9a">
+      <w:hyperlink w:history="1" r:id="rIdomacj1sevq4f14pfs8sfp">
         <w:r>
           <w:rPr>
             <w:rFonts w:ascii="Times New Roman" w:cs="Times New Roman" w:eastAsia="Times New Roman" w:hAnsi="Times New Roman"/>
@@ -68,7 +68,7 @@
         </w:rPr>
         <w:t xml:space="preserve"> | </w:t>
       </w:r>
-      <w:hyperlink w:history="1" r:id="rId_tin4hxamhgeqcio5v_wx">
+      <w:hyperlink w:history="1" r:id="rIdzzcr3sfaepo4pxn7f9hs_">
         <w:r>
           <w:rPr>
             <w:rFonts w:ascii="Times New Roman" w:cs="Times New Roman" w:eastAsia="Times New Roman" w:hAnsi="Times New Roman"/>
@@ -86,7 +86,7 @@
         </w:rPr>
         <w:t xml:space="preserve"> | </w:t>
       </w:r>
-      <w:hyperlink w:history="1" r:id="rId18ucnucguozcvn7shc5gi">
+      <w:hyperlink w:history="1" r:id="rIdzvo13vp0xseoryigeo9kb">
         <w:r>
           <w:rPr>
             <w:rFonts w:ascii="Times New Roman" w:cs="Times New Roman" w:eastAsia="Times New Roman" w:hAnsi="Times New Roman"/>
@@ -429,7 +429,7 @@
         </w:tabs>
         <w:spacing w:before="0" w:line="235" w:lineRule="exact"/>
       </w:pPr>
-      <w:hyperlink w:history="1" r:id="rIdkrxj40tja8n4z3byrkxqc">
+      <w:hyperlink w:history="1" r:id="rIdtvo2pry_lvy7tmbmqngoa">
         <w:r>
           <w:rPr>
             <w:rFonts w:ascii="Times New Roman" w:cs="Times New Roman" w:eastAsia="Times New Roman" w:hAnsi="Times New Roman"/>
@@ -522,7 +522,7 @@
         </w:tabs>
         <w:spacing w:before="54" w:line="235" w:lineRule="exact"/>
       </w:pPr>
-      <w:hyperlink w:history="1" r:id="rIdqcc6zugkipr4ajqgoo3u9">
+      <w:hyperlink w:history="1" r:id="rIdmdhvsvfyeqlu41pl_l9vx">
         <w:r>
           <w:rPr>
             <w:rFonts w:ascii="Times New Roman" w:cs="Times New Roman" w:eastAsia="Times New Roman" w:hAnsi="Times New Roman"/>
@@ -563,7 +563,7 @@
       <w:r>
         <w:tab/>
       </w:r>
-      <w:hyperlink w:history="1" r:id="rIdfpnjeqfsqi_uvaay2pacs">
+      <w:hyperlink w:history="1" r:id="rIdlv8o7ntui0fphet5le7hg">
         <w:r>
           <w:rPr>
             <w:rFonts w:ascii="Times New Roman" w:cs="Times New Roman" w:eastAsia="Times New Roman" w:hAnsi="Times New Roman"/>
@@ -617,7 +617,7 @@
         </w:tabs>
         <w:spacing w:before="54" w:line="235" w:lineRule="exact"/>
       </w:pPr>
-      <w:hyperlink w:history="1" r:id="rIdis3pynkp9hnn9qkpc_v7x">
+      <w:hyperlink w:history="1" r:id="rIdq0a3zcf57vdblucjib3vi">
         <w:r>
           <w:rPr>
             <w:rFonts w:ascii="Times New Roman" w:cs="Times New Roman" w:eastAsia="Times New Roman" w:hAnsi="Times New Roman"/>
@@ -640,7 +640,7 @@
       <w:r>
         <w:tab/>
       </w:r>
-      <w:hyperlink w:history="1" r:id="rId8xxvsbqsmdygebtl0evs3">
+      <w:hyperlink w:history="1" r:id="rId9krf49uv00jwkdaocg7lb">
         <w:r>
           <w:rPr>
             <w:rFonts w:ascii="Times New Roman" w:cs="Times New Roman" w:eastAsia="Times New Roman" w:hAnsi="Times New Roman"/>
@@ -694,7 +694,7 @@
         </w:tabs>
         <w:spacing w:before="54" w:line="235" w:lineRule="exact"/>
       </w:pPr>
-      <w:hyperlink w:history="1" r:id="rIdjhsc93ujxysyloa1yi3nk">
+      <w:hyperlink w:history="1" r:id="rIdzel484jeaqptsu0v4azy2">
         <w:r>
           <w:rPr>
             <w:rFonts w:ascii="Times New Roman" w:cs="Times New Roman" w:eastAsia="Times New Roman" w:hAnsi="Times New Roman"/>
@@ -727,7 +727,7 @@
       <w:r>
         <w:tab/>
       </w:r>
-      <w:hyperlink w:history="1" r:id="rIdd6m0k-lma_fmtwxdwaenm">
+      <w:hyperlink w:history="1" r:id="rIdgxqvmoaz4etgvjpupdknx">
         <w:r>
           <w:rPr>
             <w:rFonts w:ascii="Times New Roman" w:cs="Times New Roman" w:eastAsia="Times New Roman" w:hAnsi="Times New Roman"/>

</xml_diff>

<commit_message>
Résumé .docx: mirror the current résumé (it had fallen behind resume.html)
Co-Authored-By: Claude Opus 5.5 <noreply@anthropic.com>
Claude-Session: https://claude.ai/code/session_01B1JoCfzmbRMHJEkBTWzRWk
</commit_message>
<xml_diff>
--- a/resume/jaspersands_resume.docx
+++ b/resume/jaspersands_resume.docx
@@ -32,7 +32,7 @@
         </w:rPr>
         <w:t xml:space="preserve">Palo Alto, CA | +1 (650) 924-8429 | </w:t>
       </w:r>
-      <w:hyperlink w:history="1" r:id="rIdldwvqwpzrf0uixmu95unn">
+      <w:hyperlink w:history="1" r:id="rIdblkcawvk6hpk_qoil5wvb">
         <w:r>
           <w:rPr>
             <w:rFonts w:ascii="Times New Roman" w:cs="Times New Roman" w:eastAsia="Times New Roman" w:hAnsi="Times New Roman"/>
@@ -50,7 +50,7 @@
         </w:rPr>
         <w:t xml:space="preserve"> | </w:t>
       </w:r>
-      <w:hyperlink w:history="1" r:id="rIdomacj1sevq4f14pfs8sfp">
+      <w:hyperlink w:history="1" r:id="rIdxettoj2shzvktrwwlewxl">
         <w:r>
           <w:rPr>
             <w:rFonts w:ascii="Times New Roman" w:cs="Times New Roman" w:eastAsia="Times New Roman" w:hAnsi="Times New Roman"/>
@@ -68,7 +68,7 @@
         </w:rPr>
         <w:t xml:space="preserve"> | </w:t>
       </w:r>
-      <w:hyperlink w:history="1" r:id="rIdzzcr3sfaepo4pxn7f9hs_">
+      <w:hyperlink w:history="1" r:id="rId_s7vimouqfykjxxpzfftd">
         <w:r>
           <w:rPr>
             <w:rFonts w:ascii="Times New Roman" w:cs="Times New Roman" w:eastAsia="Times New Roman" w:hAnsi="Times New Roman"/>
@@ -86,7 +86,7 @@
         </w:rPr>
         <w:t xml:space="preserve"> | </w:t>
       </w:r>
-      <w:hyperlink w:history="1" r:id="rIdzvo13vp0xseoryigeo9kb">
+      <w:hyperlink w:history="1" r:id="rIdayzn0ucoznaxhfvuvz-zo">
         <w:r>
           <w:rPr>
             <w:rFonts w:ascii="Times New Roman" w:cs="Times New Roman" w:eastAsia="Times New Roman" w:hAnsi="Times New Roman"/>
@@ -108,7 +108,7 @@
           <w:sz w:val="20"/>
           <w:szCs w:val="20"/>
         </w:rPr>
-        <w:t xml:space="preserve">Quantum error correction, quantum algorithms, and machine learning for quantum-device characterization. MS in Computer Science at Columbia. Thesis at Diraq and UNSW Sydney on automating silicon spin qubit measurement.</w:t>
+        <w:t xml:space="preserve">Quantum error correction, fault-tolerant quantum algorithms, and machine learning for quantum-device characterization. MS in Computer Science at Columbia. Thesis at Diraq and UNSW Sydney on automating silicon spin qubit measurement.</w:t>
       </w:r>
     </w:p>
     <w:p>
@@ -427,9 +427,276 @@
         <w:tabs>
           <w:tab w:val="right" w:pos="10800"/>
         </w:tabs>
-        <w:spacing w:before="0" w:line="235" w:lineRule="exact"/>
-      </w:pPr>
-      <w:hyperlink w:history="1" r:id="rIdtvo2pry_lvy7tmbmqngoa">
+        <w:spacing w:before="42" w:line="235" w:lineRule="exact"/>
+      </w:pPr>
+      <w:hyperlink w:history="1" r:id="rIdfehzwl8j06mowslqvlj2l">
+        <w:r>
+          <w:rPr>
+            <w:rFonts w:ascii="Times New Roman" w:cs="Times New Roman" w:eastAsia="Times New Roman" w:hAnsi="Times New Roman"/>
+            <w:b/>
+            <w:bCs/>
+            <w:sz w:val="20"/>
+            <w:szCs w:val="20"/>
+          </w:rPr>
+          <w:t xml:space="preserve">stabilizer-qec</w:t>
+        </w:r>
+      </w:hyperlink>
+      <w:r>
+        <w:rPr>
+          <w:rFonts w:ascii="Times New Roman" w:cs="Times New Roman" w:eastAsia="Times New Roman" w:hAnsi="Times New Roman"/>
+          <w:sz w:val="20"/>
+          <w:szCs w:val="20"/>
+        </w:rPr>
+        <w:t xml:space="preserve">: surface-code simulator and decoder</w:t>
+      </w:r>
+      <w:r>
+        <w:rPr>
+          <w:rFonts w:ascii="Times New Roman" w:cs="Times New Roman" w:eastAsia="Times New Roman" w:hAnsi="Times New Roman"/>
+          <w:sz w:val="20"/>
+          <w:szCs w:val="20"/>
+        </w:rPr>
+        <w:t xml:space="preserve"> · </w:t>
+      </w:r>
+      <w:r>
+        <w:rPr>
+          <w:rFonts w:ascii="Times New Roman" w:cs="Times New Roman" w:eastAsia="Times New Roman" w:hAnsi="Times New Roman"/>
+          <w:i/>
+          <w:iCs/>
+          <w:sz w:val="20"/>
+          <w:szCs w:val="20"/>
+        </w:rPr>
+        <w:t xml:space="preserve">Rust, Python, WebAssembly</w:t>
+      </w:r>
+      <w:r>
+        <w:tab/>
+      </w:r>
+      <w:hyperlink w:history="1" r:id="rIdfzhvdodelgoqxc0jqbd7p">
+        <w:r>
+          <w:rPr>
+            <w:rFonts w:ascii="Times New Roman" w:cs="Times New Roman" w:eastAsia="Times New Roman" w:hAnsi="Times New Roman"/>
+            <w:sz w:val="20"/>
+            <w:szCs w:val="20"/>
+          </w:rPr>
+          <w:t xml:space="preserve">qcompiler.jaspersands.com</w:t>
+        </w:r>
+      </w:hyperlink>
+    </w:p>
+    <w:p>
+      <w:pPr>
+        <w:pStyle w:val="ListParagraph"/>
+        <w:numPr>
+          <w:ilvl w:val="0"/>
+          <w:numId w:val="2"/>
+        </w:numPr>
+        <w:spacing w:before="12" w:line="235" w:lineRule="exact"/>
+      </w:pPr>
+      <w:r>
+        <w:rPr>
+          <w:rFonts w:ascii="Times New Roman" w:cs="Times New Roman" w:eastAsia="Times New Roman" w:hAnsi="Times New Roman"/>
+          <w:sz w:val="20"/>
+          <w:szCs w:val="20"/>
+        </w:rPr>
+        <w:t xml:space="preserve">Circuit-level simulator and decoders for surface, XZZX and IBM gross codes; matches Stim and PyMatching shot for shot.</w:t>
+      </w:r>
+    </w:p>
+    <w:p>
+      <w:pPr>
+        <w:pStyle w:val="ListParagraph"/>
+        <w:numPr>
+          <w:ilvl w:val="0"/>
+          <w:numId w:val="2"/>
+        </w:numPr>
+        <w:spacing w:before="12" w:line="235" w:lineRule="exact"/>
+      </w:pPr>
+      <w:r>
+        <w:rPr>
+          <w:rFonts w:ascii="Times New Roman" w:cs="Times New Roman" w:eastAsia="Times New Roman" w:hAnsi="Times New Roman"/>
+          <w:sz w:val="20"/>
+          <w:szCs w:val="20"/>
+        </w:rPr>
+        <w:t xml:space="preserve">Rebuilt Google's Willow and Sycamore experiments (27.5M shots) from raw measurements bit for bit and fitted Λ as Google does.</w:t>
+      </w:r>
+    </w:p>
+    <w:p>
+      <w:pPr>
+        <w:tabs>
+          <w:tab w:val="right" w:pos="10800"/>
+        </w:tabs>
+        <w:spacing w:before="54" w:line="235" w:lineRule="exact"/>
+      </w:pPr>
+      <w:hyperlink w:history="1" r:id="rIddpl5kfo07re3ok5jbulp8">
+        <w:r>
+          <w:rPr>
+            <w:rFonts w:ascii="Times New Roman" w:cs="Times New Roman" w:eastAsia="Times New Roman" w:hAnsi="Times New Roman"/>
+            <w:b/>
+            <w:bCs/>
+            <w:sz w:val="20"/>
+            <w:szCs w:val="20"/>
+          </w:rPr>
+          <w:t xml:space="preserve">ft-algorithms</w:t>
+        </w:r>
+      </w:hyperlink>
+      <w:r>
+        <w:rPr>
+          <w:rFonts w:ascii="Times New Roman" w:cs="Times New Roman" w:eastAsia="Times New Roman" w:hAnsi="Times New Roman"/>
+          <w:sz w:val="20"/>
+          <w:szCs w:val="20"/>
+        </w:rPr>
+        <w:t xml:space="preserve">: algorithms on a simulated fault-tolerant quantum computer</w:t>
+      </w:r>
+      <w:r>
+        <w:rPr>
+          <w:rFonts w:ascii="Times New Roman" w:cs="Times New Roman" w:eastAsia="Times New Roman" w:hAnsi="Times New Roman"/>
+          <w:sz w:val="20"/>
+          <w:szCs w:val="20"/>
+        </w:rPr>
+        <w:t xml:space="preserve"> · </w:t>
+      </w:r>
+      <w:r>
+        <w:rPr>
+          <w:rFonts w:ascii="Times New Roman" w:cs="Times New Roman" w:eastAsia="Times New Roman" w:hAnsi="Times New Roman"/>
+          <w:i/>
+          <w:iCs/>
+          <w:sz w:val="20"/>
+          <w:szCs w:val="20"/>
+        </w:rPr>
+        <w:t xml:space="preserve">Rust, Python</w:t>
+      </w:r>
+      <w:r>
+        <w:tab/>
+      </w:r>
+      <w:hyperlink w:history="1" r:id="rIdmr5wzwxhfh_1cqygxqbiw">
+        <w:r>
+          <w:rPr>
+            <w:rFonts w:ascii="Times New Roman" w:cs="Times New Roman" w:eastAsia="Times New Roman" w:hAnsi="Times New Roman"/>
+            <w:sz w:val="20"/>
+            <w:szCs w:val="20"/>
+          </w:rPr>
+          <w:t xml:space="preserve">ft.jaspersands.com</w:t>
+        </w:r>
+      </w:hyperlink>
+    </w:p>
+    <w:p>
+      <w:pPr>
+        <w:pStyle w:val="ListParagraph"/>
+        <w:numPr>
+          <w:ilvl w:val="0"/>
+          <w:numId w:val="2"/>
+        </w:numPr>
+        <w:spacing w:before="12" w:line="235" w:lineRule="exact"/>
+      </w:pPr>
+      <w:r>
+        <w:rPr>
+          <w:rFonts w:ascii="Times New Roman" w:cs="Times New Roman" w:eastAsia="Times New Roman" w:hAnsi="Times New Roman"/>
+          <w:sz w:val="20"/>
+          <w:szCs w:val="20"/>
+        </w:rPr>
+        <w:t xml:space="preserve">Runs Shor (N ≤ 143) and H₂/LiH phase estimation on a lattice-surgery machine fitted to 316 circuit-level QEC experiments.</w:t>
+      </w:r>
+    </w:p>
+    <w:p>
+      <w:pPr>
+        <w:pStyle w:val="ListParagraph"/>
+        <w:numPr>
+          <w:ilvl w:val="0"/>
+          <w:numId w:val="2"/>
+        </w:numPr>
+        <w:spacing w:before="12" w:line="235" w:lineRule="exact"/>
+      </w:pPr>
+      <w:r>
+        <w:rPr>
+          <w:rFonts w:ascii="Times New Roman" w:cs="Times New Roman" w:eastAsia="Times New Roman" w:hAnsi="Times New Roman"/>
+          <w:sz w:val="20"/>
+          <w:szCs w:val="20"/>
+        </w:rPr>
+        <w:t xml:space="preserve">Reproduces Gidney's 2025 RSA-2048 distance (d = 25) under his noise projection; measured noise needs d = 27–29.</w:t>
+      </w:r>
+    </w:p>
+    <w:p>
+      <w:pPr>
+        <w:tabs>
+          <w:tab w:val="right" w:pos="10800"/>
+        </w:tabs>
+        <w:spacing w:before="54" w:line="235" w:lineRule="exact"/>
+      </w:pPr>
+      <w:hyperlink w:history="1" r:id="rIdrhctlyxyc7emakhjsurew">
+        <w:r>
+          <w:rPr>
+            <w:rFonts w:ascii="Times New Roman" w:cs="Times New Roman" w:eastAsia="Times New Roman" w:hAnsi="Times New Roman"/>
+            <w:b/>
+            <w:bCs/>
+            <w:sz w:val="20"/>
+            <w:szCs w:val="20"/>
+          </w:rPr>
+          <w:t xml:space="preserve">Q-Search</w:t>
+        </w:r>
+      </w:hyperlink>
+      <w:r>
+        <w:rPr>
+          <w:rFonts w:ascii="Times New Roman" w:cs="Times New Roman" w:eastAsia="Times New Roman" w:hAnsi="Times New Roman"/>
+          <w:sz w:val="20"/>
+          <w:szCs w:val="20"/>
+        </w:rPr>
+        <w:t xml:space="preserve">: proof-gated quantum algorithm research and verification engine</w:t>
+      </w:r>
+      <w:r>
+        <w:tab/>
+      </w:r>
+      <w:hyperlink w:history="1" r:id="rIds9_smdszcx6pajyxn8edp">
+        <w:r>
+          <w:rPr>
+            <w:rFonts w:ascii="Times New Roman" w:cs="Times New Roman" w:eastAsia="Times New Roman" w:hAnsi="Times New Roman"/>
+            <w:sz w:val="20"/>
+            <w:szCs w:val="20"/>
+          </w:rPr>
+          <w:t xml:space="preserve">qsearch.jaspersands.com</w:t>
+        </w:r>
+      </w:hyperlink>
+    </w:p>
+    <w:p>
+      <w:pPr>
+        <w:pStyle w:val="ListParagraph"/>
+        <w:numPr>
+          <w:ilvl w:val="0"/>
+          <w:numId w:val="2"/>
+        </w:numPr>
+        <w:spacing w:before="12" w:line="235" w:lineRule="exact"/>
+      </w:pPr>
+      <w:r>
+        <w:rPr>
+          <w:rFonts w:ascii="Times New Roman" w:cs="Times New Roman" w:eastAsia="Times New Roman" w:hAnsi="Times New Roman"/>
+          <w:sz w:val="20"/>
+          <w:szCs w:val="20"/>
+        </w:rPr>
+        <w:t xml:space="preserve">Automated search for structural quantum advantage on non-abelian HSP, dihedral coset, and linear code equivalence problems.</w:t>
+      </w:r>
+    </w:p>
+    <w:p>
+      <w:pPr>
+        <w:pStyle w:val="ListParagraph"/>
+        <w:numPr>
+          <w:ilvl w:val="0"/>
+          <w:numId w:val="2"/>
+        </w:numPr>
+        <w:spacing w:before="12" w:line="235" w:lineRule="exact"/>
+      </w:pPr>
+      <w:r>
+        <w:rPr>
+          <w:rFonts w:ascii="Times New Roman" w:cs="Times New Roman" w:eastAsia="Times New Roman" w:hAnsi="Times New Roman"/>
+          <w:sz w:val="20"/>
+          <w:szCs w:val="20"/>
+        </w:rPr>
+        <w:t xml:space="preserve">Formal proof gates test each mechanism against 1,200+ classical baselines across 720+ theorem modules, indexing negative results.</w:t>
+      </w:r>
+    </w:p>
+    <w:p>
+      <w:pPr>
+        <w:tabs>
+          <w:tab w:val="right" w:pos="10800"/>
+        </w:tabs>
+        <w:spacing w:before="54" w:line="235" w:lineRule="exact"/>
+      </w:pPr>
+      <w:hyperlink w:history="1" r:id="rIdukoe4v0xdysj8loe_rkir">
         <w:r>
           <w:rPr>
             <w:rFonts w:ascii="Times New Roman" w:cs="Times New Roman" w:eastAsia="Times New Roman" w:hAnsi="Times New Roman"/>
@@ -476,7 +743,7 @@
           <w:sz w:val="20"/>
           <w:szCs w:val="20"/>
         </w:rPr>
-        <w:t xml:space="preserve"/>
+        <w:t xml:space="preserve">MIT iQuHACK 2026</w:t>
       </w:r>
     </w:p>
     <w:p>
@@ -517,30 +784,39 @@
     </w:p>
     <w:p>
       <w:pPr>
+        <w:pBdr>
+          <w:bottom w:val="single" w:color="000000" w:sz="6" w:space="1"/>
+        </w:pBdr>
+        <w:spacing w:after="16" w:before="100" w:line="235" w:lineRule="exact"/>
+      </w:pPr>
+      <w:r>
+        <w:rPr>
+          <w:rFonts w:ascii="Times New Roman" w:cs="Times New Roman" w:eastAsia="Times New Roman" w:hAnsi="Times New Roman"/>
+          <w:b/>
+          <w:bCs/>
+          <w:spacing w:val="16"/>
+          <w:sz w:val="21"/>
+          <w:szCs w:val="21"/>
+        </w:rPr>
+        <w:t xml:space="preserve">RESEARCH</w:t>
+      </w:r>
+    </w:p>
+    <w:p>
+      <w:pPr>
         <w:tabs>
           <w:tab w:val="right" w:pos="10800"/>
         </w:tabs>
-        <w:spacing w:before="54" w:line="235" w:lineRule="exact"/>
-      </w:pPr>
-      <w:hyperlink w:history="1" r:id="rIdmdhvsvfyeqlu41pl_l9vx">
-        <w:r>
-          <w:rPr>
-            <w:rFonts w:ascii="Times New Roman" w:cs="Times New Roman" w:eastAsia="Times New Roman" w:hAnsi="Times New Roman"/>
-            <w:b/>
-            <w:bCs/>
-            <w:sz w:val="20"/>
-            <w:szCs w:val="20"/>
-          </w:rPr>
-          <w:t xml:space="preserve">WASM QEC Simulator</w:t>
-        </w:r>
-      </w:hyperlink>
-      <w:r>
-        <w:rPr>
-          <w:rFonts w:ascii="Times New Roman" w:cs="Times New Roman" w:eastAsia="Times New Roman" w:hAnsi="Times New Roman"/>
-          <w:sz w:val="20"/>
-          <w:szCs w:val="20"/>
-        </w:rPr>
-        <w:t xml:space="preserve">: surface-code decoding in the browser</w:t>
+        <w:spacing w:before="42" w:line="235" w:lineRule="exact"/>
+      </w:pPr>
+      <w:r>
+        <w:rPr>
+          <w:rFonts w:ascii="Times New Roman" w:cs="Times New Roman" w:eastAsia="Times New Roman" w:hAnsi="Times New Roman"/>
+          <w:b/>
+          <w:bCs/>
+          <w:sz w:val="20"/>
+          <w:szCs w:val="20"/>
+        </w:rPr>
+        <w:t xml:space="preserve">Diraq / UNSW Sydney</w:t>
       </w:r>
       <w:r>
         <w:rPr>
@@ -558,21 +834,19 @@
           <w:sz w:val="20"/>
           <w:szCs w:val="20"/>
         </w:rPr>
-        <w:t xml:space="preserve">Rust, WebAssembly</w:t>
+        <w:t xml:space="preserve">MS Thesis Research</w:t>
       </w:r>
       <w:r>
         <w:tab/>
       </w:r>
-      <w:hyperlink w:history="1" r:id="rIdlv8o7ntui0fphet5le7hg">
-        <w:r>
-          <w:rPr>
-            <w:rFonts w:ascii="Times New Roman" w:cs="Times New Roman" w:eastAsia="Times New Roman" w:hAnsi="Times New Roman"/>
-            <w:sz w:val="20"/>
-            <w:szCs w:val="20"/>
-          </w:rPr>
-          <w:t xml:space="preserve">qcompiler.jaspersands.com</w:t>
-        </w:r>
-      </w:hyperlink>
+      <w:r>
+        <w:rPr>
+          <w:rFonts w:ascii="Times New Roman" w:cs="Times New Roman" w:eastAsia="Times New Roman" w:hAnsi="Times New Roman"/>
+          <w:sz w:val="20"/>
+          <w:szCs w:val="20"/>
+        </w:rPr>
+        <w:t xml:space="preserve">Sep 2026 – May 2027</w:t>
+      </w:r>
     </w:p>
     <w:p>
       <w:pPr>
@@ -589,7 +863,7 @@
           <w:sz w:val="20"/>
           <w:szCs w:val="20"/>
         </w:rPr>
-        <w:t xml:space="preserve">Symplectic stabilizer simulator for rotated and XZZX surface codes, with exact MWPM and Union-Find decoding client-side.</w:t>
+        <w:t xml:space="preserve">Automating silicon spin qubit characterization under Dr. Nard Dumoulin Stuyck, replacing manual tuning and interpretation.</w:t>
       </w:r>
     </w:p>
     <w:p>
@@ -607,7 +881,7 @@
           <w:sz w:val="20"/>
           <w:szCs w:val="20"/>
         </w:rPr>
-        <w:t xml:space="preserve">Finite-size scaling puts the threshold at 3.2% with MWPM, 2.7% with Union-Find, and 14.7% under code-capacity noise.</w:t>
+        <w:t xml:space="preserve">Acquiring charge measurements from cryogenic probing, and classifying device states against what an expert would call by hand.</w:t>
       </w:r>
     </w:p>
     <w:p>
@@ -617,39 +891,53 @@
         </w:tabs>
         <w:spacing w:before="54" w:line="235" w:lineRule="exact"/>
       </w:pPr>
-      <w:hyperlink w:history="1" r:id="rIdq0a3zcf57vdblucjib3vi">
-        <w:r>
-          <w:rPr>
-            <w:rFonts w:ascii="Times New Roman" w:cs="Times New Roman" w:eastAsia="Times New Roman" w:hAnsi="Times New Roman"/>
-            <w:b/>
-            <w:bCs/>
-            <w:sz w:val="20"/>
-            <w:szCs w:val="20"/>
-          </w:rPr>
-          <w:t xml:space="preserve">Q-Search</w:t>
-        </w:r>
-      </w:hyperlink>
-      <w:r>
-        <w:rPr>
-          <w:rFonts w:ascii="Times New Roman" w:cs="Times New Roman" w:eastAsia="Times New Roman" w:hAnsi="Times New Roman"/>
-          <w:sz w:val="20"/>
-          <w:szCs w:val="20"/>
-        </w:rPr>
-        <w:t xml:space="preserve">: proof-gated quantum algorithm research and verification engine</w:t>
+      <w:r>
+        <w:rPr>
+          <w:rFonts w:ascii="Times New Roman" w:cs="Times New Roman" w:eastAsia="Times New Roman" w:hAnsi="Times New Roman"/>
+          <w:b/>
+          <w:bCs/>
+          <w:sz w:val="20"/>
+          <w:szCs w:val="20"/>
+        </w:rPr>
+        <w:t xml:space="preserve">Cidon Systems Research Lab</w:t>
+      </w:r>
+      <w:r>
+        <w:rPr>
+          <w:rFonts w:ascii="Times New Roman" w:cs="Times New Roman" w:eastAsia="Times New Roman" w:hAnsi="Times New Roman"/>
+          <w:sz w:val="20"/>
+          <w:szCs w:val="20"/>
+        </w:rPr>
+        <w:t xml:space="preserve">, Columbia University</w:t>
+      </w:r>
+      <w:r>
+        <w:rPr>
+          <w:rFonts w:ascii="Times New Roman" w:cs="Times New Roman" w:eastAsia="Times New Roman" w:hAnsi="Times New Roman"/>
+          <w:sz w:val="20"/>
+          <w:szCs w:val="20"/>
+        </w:rPr>
+        <w:t xml:space="preserve"> · </w:t>
+      </w:r>
+      <w:r>
+        <w:rPr>
+          <w:rFonts w:ascii="Times New Roman" w:cs="Times New Roman" w:eastAsia="Times New Roman" w:hAnsi="Times New Roman"/>
+          <w:i/>
+          <w:iCs/>
+          <w:sz w:val="20"/>
+          <w:szCs w:val="20"/>
+        </w:rPr>
+        <w:t xml:space="preserve">Graduate Researcher</w:t>
       </w:r>
       <w:r>
         <w:tab/>
       </w:r>
-      <w:hyperlink w:history="1" r:id="rId9krf49uv00jwkdaocg7lb">
-        <w:r>
-          <w:rPr>
-            <w:rFonts w:ascii="Times New Roman" w:cs="Times New Roman" w:eastAsia="Times New Roman" w:hAnsi="Times New Roman"/>
-            <w:sz w:val="20"/>
-            <w:szCs w:val="20"/>
-          </w:rPr>
-          <w:t xml:space="preserve">qsearch.jaspersands.com</w:t>
-        </w:r>
-      </w:hyperlink>
+      <w:r>
+        <w:rPr>
+          <w:rFonts w:ascii="Times New Roman" w:cs="Times New Roman" w:eastAsia="Times New Roman" w:hAnsi="Times New Roman"/>
+          <w:sz w:val="20"/>
+          <w:szCs w:val="20"/>
+        </w:rPr>
+        <w:t xml:space="preserve">Sep 2025 – Jun 2026</w:t>
+      </w:r>
     </w:p>
     <w:p>
       <w:pPr>
@@ -666,7 +954,62 @@
           <w:sz w:val="20"/>
           <w:szCs w:val="20"/>
         </w:rPr>
-        <w:t xml:space="preserve">Automated search for structural quantum advantage on non-abelian HSP, dihedral coset, and linear code equivalence problems.</w:t>
+        <w:t xml:space="preserve">Built phishing and spam detection with Dr. Asaf Cidon and Barracuda Networks from LLM embeddings and email telemetry.</w:t>
+      </w:r>
+    </w:p>
+    <w:p>
+      <w:pPr>
+        <w:tabs>
+          <w:tab w:val="right" w:pos="10800"/>
+        </w:tabs>
+        <w:spacing w:before="54" w:line="235" w:lineRule="exact"/>
+      </w:pPr>
+      <w:r>
+        <w:rPr>
+          <w:rFonts w:ascii="Times New Roman" w:cs="Times New Roman" w:eastAsia="Times New Roman" w:hAnsi="Times New Roman"/>
+          <w:b/>
+          <w:bCs/>
+          <w:sz w:val="20"/>
+          <w:szCs w:val="20"/>
+        </w:rPr>
+        <w:t xml:space="preserve">Complex Resilient Intelligent Systems Lab</w:t>
+      </w:r>
+      <w:r>
+        <w:rPr>
+          <w:rFonts w:ascii="Times New Roman" w:cs="Times New Roman" w:eastAsia="Times New Roman" w:hAnsi="Times New Roman"/>
+          <w:sz w:val="20"/>
+          <w:szCs w:val="20"/>
+        </w:rPr>
+        <w:t xml:space="preserve">, Columbia University</w:t>
+      </w:r>
+      <w:r>
+        <w:rPr>
+          <w:rFonts w:ascii="Times New Roman" w:cs="Times New Roman" w:eastAsia="Times New Roman" w:hAnsi="Times New Roman"/>
+          <w:sz w:val="20"/>
+          <w:szCs w:val="20"/>
+        </w:rPr>
+        <w:t xml:space="preserve"> · </w:t>
+      </w:r>
+      <w:r>
+        <w:rPr>
+          <w:rFonts w:ascii="Times New Roman" w:cs="Times New Roman" w:eastAsia="Times New Roman" w:hAnsi="Times New Roman"/>
+          <w:i/>
+          <w:iCs/>
+          <w:sz w:val="20"/>
+          <w:szCs w:val="20"/>
+        </w:rPr>
+        <w:t xml:space="preserve">Graduate Researcher</w:t>
+      </w:r>
+      <w:r>
+        <w:tab/>
+      </w:r>
+      <w:r>
+        <w:rPr>
+          <w:rFonts w:ascii="Times New Roman" w:cs="Times New Roman" w:eastAsia="Times New Roman" w:hAnsi="Times New Roman"/>
+          <w:sz w:val="20"/>
+          <w:szCs w:val="20"/>
+        </w:rPr>
+        <w:t xml:space="preserve">May – Dec 2025</w:t>
       </w:r>
     </w:p>
     <w:p>
@@ -684,7 +1027,7 @@
           <w:sz w:val="20"/>
           <w:szCs w:val="20"/>
         </w:rPr>
-        <w:t xml:space="preserve">Formal proof gates test each mechanism against 1,200+ classical baselines across 720+ theorem modules, indexing negative results.</w:t>
+        <w:t xml:space="preserve">Reduced hallucination in generative protein modeling under Dr. Venkat Venkatasubramanian, grounded in molecular graph data.</w:t>
       </w:r>
     </w:p>
     <w:p>
@@ -694,18 +1037,24 @@
         </w:tabs>
         <w:spacing w:before="54" w:line="235" w:lineRule="exact"/>
       </w:pPr>
-      <w:hyperlink w:history="1" r:id="rIdzel484jeaqptsu0v4azy2">
-        <w:r>
-          <w:rPr>
-            <w:rFonts w:ascii="Times New Roman" w:cs="Times New Roman" w:eastAsia="Times New Roman" w:hAnsi="Times New Roman"/>
-            <w:b/>
-            <w:bCs/>
-            <w:sz w:val="20"/>
-            <w:szCs w:val="20"/>
-          </w:rPr>
-          <w:t xml:space="preserve">LLM-Based Lossless Text Compression</w:t>
-        </w:r>
-      </w:hyperlink>
+      <w:r>
+        <w:rPr>
+          <w:rFonts w:ascii="Times New Roman" w:cs="Times New Roman" w:eastAsia="Times New Roman" w:hAnsi="Times New Roman"/>
+          <w:b/>
+          <w:bCs/>
+          <w:sz w:val="20"/>
+          <w:szCs w:val="20"/>
+        </w:rPr>
+        <w:t xml:space="preserve">Foster Care Policy Database</w:t>
+      </w:r>
+      <w:r>
+        <w:rPr>
+          <w:rFonts w:ascii="Times New Roman" w:cs="Times New Roman" w:eastAsia="Times New Roman" w:hAnsi="Times New Roman"/>
+          <w:sz w:val="20"/>
+          <w:szCs w:val="20"/>
+        </w:rPr>
+        <w:t xml:space="preserve">, Washington University in St. Louis</w:t>
+      </w:r>
       <w:r>
         <w:rPr>
           <w:rFonts w:ascii="Times New Roman" w:cs="Times New Roman" w:eastAsia="Times New Roman" w:hAnsi="Times New Roman"/>
@@ -722,21 +1071,19 @@
           <w:sz w:val="20"/>
           <w:szCs w:val="20"/>
         </w:rPr>
-        <w:t xml:space="preserve">PyTorch, CUDA</w:t>
+        <w:t xml:space="preserve">Undergraduate Researcher</w:t>
       </w:r>
       <w:r>
         <w:tab/>
       </w:r>
-      <w:hyperlink w:history="1" r:id="rIdgxqvmoaz4etgvjpupdknx">
-        <w:r>
-          <w:rPr>
-            <w:rFonts w:ascii="Times New Roman" w:cs="Times New Roman" w:eastAsia="Times New Roman" w:hAnsi="Times New Roman"/>
-            <w:sz w:val="20"/>
-            <w:szCs w:val="20"/>
-          </w:rPr>
-          <w:t xml:space="preserve">jaspersands.com/llmcompression</w:t>
-        </w:r>
-      </w:hyperlink>
+      <w:r>
+        <w:rPr>
+          <w:rFonts w:ascii="Times New Roman" w:cs="Times New Roman" w:eastAsia="Times New Roman" w:hAnsi="Times New Roman"/>
+          <w:sz w:val="20"/>
+          <w:szCs w:val="20"/>
+        </w:rPr>
+        <w:t xml:space="preserve">Sep 2024 – May 2025</w:t>
+      </w:r>
     </w:p>
     <w:p>
       <w:pPr>
@@ -753,7 +1100,7 @@
           <w:sz w:val="20"/>
           <w:szCs w:val="20"/>
         </w:rPr>
-        <w:t xml:space="preserve">Arithmetic coding on LLM predictions, 5–16× average and 39× best case, at 100–1000× lower throughput than gzip and zstd.</w:t>
+        <w:t xml:space="preserve">Fine-tuned LLaMA-3 with Hugging Face for QA over 50k foster-care policy documents, with human-in-the-loop feedback.</w:t>
       </w:r>
     </w:p>
     <w:p>
@@ -772,7 +1119,7 @@
           <w:sz w:val="21"/>
           <w:szCs w:val="21"/>
         </w:rPr>
-        <w:t xml:space="preserve">RESEARCH</w:t>
+        <w:t xml:space="preserve">EXPERIENCE</w:t>
       </w:r>
     </w:p>
     <w:p>
@@ -790,7 +1137,7 @@
           <w:sz w:val="20"/>
           <w:szCs w:val="20"/>
         </w:rPr>
-        <w:t xml:space="preserve">Diraq / UNSW Sydney</w:t>
+        <w:t xml:space="preserve">Smack Technologies</w:t>
       </w:r>
       <w:r>
         <w:rPr>
@@ -808,7 +1155,7 @@
           <w:sz w:val="20"/>
           <w:szCs w:val="20"/>
         </w:rPr>
-        <w:t xml:space="preserve">MS Thesis Research</w:t>
+        <w:t xml:space="preserve">AI Intern</w:t>
       </w:r>
       <w:r>
         <w:tab/>
@@ -819,7 +1166,7 @@
           <w:sz w:val="20"/>
           <w:szCs w:val="20"/>
         </w:rPr>
-        <w:t xml:space="preserve">Sep 2026 – May 2027</w:t>
+        <w:t xml:space="preserve">May – Aug 2026</w:t>
       </w:r>
     </w:p>
     <w:p>
@@ -837,7 +1184,7 @@
           <w:sz w:val="20"/>
           <w:szCs w:val="20"/>
         </w:rPr>
-        <w:t xml:space="preserve">Automating silicon spin qubit characterization under Dr. Nard Dumoulin Stuyck, replacing manual tuning and interpretation.</w:t>
+        <w:t xml:space="preserve">Built physics and sensor simulation, integrating the knowledge graph to expand corpus generation.</w:t>
       </w:r>
     </w:p>
     <w:p>
@@ -855,62 +1202,7 @@
           <w:sz w:val="20"/>
           <w:szCs w:val="20"/>
         </w:rPr>
-        <w:t xml:space="preserve">Acquiring charge measurements from cryogenic probing, and classifying device states against what an expert would call by hand.</w:t>
-      </w:r>
-    </w:p>
-    <w:p>
-      <w:pPr>
-        <w:tabs>
-          <w:tab w:val="right" w:pos="10800"/>
-        </w:tabs>
-        <w:spacing w:before="54" w:line="235" w:lineRule="exact"/>
-      </w:pPr>
-      <w:r>
-        <w:rPr>
-          <w:rFonts w:ascii="Times New Roman" w:cs="Times New Roman" w:eastAsia="Times New Roman" w:hAnsi="Times New Roman"/>
-          <w:b/>
-          <w:bCs/>
-          <w:sz w:val="20"/>
-          <w:szCs w:val="20"/>
-        </w:rPr>
-        <w:t xml:space="preserve">Cidon Systems Research Lab</w:t>
-      </w:r>
-      <w:r>
-        <w:rPr>
-          <w:rFonts w:ascii="Times New Roman" w:cs="Times New Roman" w:eastAsia="Times New Roman" w:hAnsi="Times New Roman"/>
-          <w:sz w:val="20"/>
-          <w:szCs w:val="20"/>
-        </w:rPr>
-        <w:t xml:space="preserve">, Columbia University</w:t>
-      </w:r>
-      <w:r>
-        <w:rPr>
-          <w:rFonts w:ascii="Times New Roman" w:cs="Times New Roman" w:eastAsia="Times New Roman" w:hAnsi="Times New Roman"/>
-          <w:sz w:val="20"/>
-          <w:szCs w:val="20"/>
-        </w:rPr>
-        <w:t xml:space="preserve"> · </w:t>
-      </w:r>
-      <w:r>
-        <w:rPr>
-          <w:rFonts w:ascii="Times New Roman" w:cs="Times New Roman" w:eastAsia="Times New Roman" w:hAnsi="Times New Roman"/>
-          <w:i/>
-          <w:iCs/>
-          <w:sz w:val="20"/>
-          <w:szCs w:val="20"/>
-        </w:rPr>
-        <w:t xml:space="preserve">Graduate Researcher</w:t>
-      </w:r>
-      <w:r>
-        <w:tab/>
-      </w:r>
-      <w:r>
-        <w:rPr>
-          <w:rFonts w:ascii="Times New Roman" w:cs="Times New Roman" w:eastAsia="Times New Roman" w:hAnsi="Times New Roman"/>
-          <w:sz w:val="20"/>
-          <w:szCs w:val="20"/>
-        </w:rPr>
-        <w:t xml:space="preserve">Sep 2025 – Jun 2026</w:t>
+        <w:t xml:space="preserve">Benchmarked open-weight models head to head on speed, intelligence and concurrency, speeding corpus generation 64x.</w:t>
       </w:r>
     </w:p>
     <w:p>
@@ -928,7 +1220,7 @@
           <w:sz w:val="20"/>
           <w:szCs w:val="20"/>
         </w:rPr>
-        <w:t xml:space="preserve">Built phishing and spam detection pipelines with Dr. Asaf Cidon and Barracuda Networks, combining language-model embeddings with production email telemetry and tuning for precision against a fixed false-positive budget.</w:t>
+        <w:t xml:space="preserve">Bounded simulator error to 0.55% against references outside its own tests, in a report that regenerates when the physics changes.</w:t>
       </w:r>
     </w:p>
     <w:p>
@@ -946,15 +1238,7 @@
           <w:sz w:val="20"/>
           <w:szCs w:val="20"/>
         </w:rPr>
-        <w:t xml:space="preserve">Complex Resilient Intelligent Systems Lab</w:t>
-      </w:r>
-      <w:r>
-        <w:rPr>
-          <w:rFonts w:ascii="Times New Roman" w:cs="Times New Roman" w:eastAsia="Times New Roman" w:hAnsi="Times New Roman"/>
-          <w:sz w:val="20"/>
-          <w:szCs w:val="20"/>
-        </w:rPr>
-        <w:t xml:space="preserve">, Columbia University</w:t>
+        <w:t xml:space="preserve">Highnote</w:t>
       </w:r>
       <w:r>
         <w:rPr>
@@ -972,7 +1256,7 @@
           <w:sz w:val="20"/>
           <w:szCs w:val="20"/>
         </w:rPr>
-        <w:t xml:space="preserve">Graduate Researcher</w:t>
+        <w:t xml:space="preserve">Cybersecurity Engineer Intern</w:t>
       </w:r>
       <w:r>
         <w:tab/>
@@ -983,7 +1267,7 @@
           <w:sz w:val="20"/>
           <w:szCs w:val="20"/>
         </w:rPr>
-        <w:t xml:space="preserve">May – Dec 2025</w:t>
+        <w:t xml:space="preserve">May – Jul 2024</w:t>
       </w:r>
     </w:p>
     <w:p>
@@ -1001,7 +1285,7 @@
           <w:sz w:val="20"/>
           <w:szCs w:val="20"/>
         </w:rPr>
-        <w:t xml:space="preserve">Reduced hallucination in generative protein modeling under Dr. Venkat Venkatasubramanian, grounded in molecular graph data.</w:t>
+        <w:t xml:space="preserve">Built the company-wide SIEM for a card-issuing fintech: AWS, GCP and Datadog logs in one Elasticsearch cluster (1 TB/day), 100+ detections.</w:t>
       </w:r>
     </w:p>
     <w:p>
@@ -1019,15 +1303,7 @@
           <w:sz w:val="20"/>
           <w:szCs w:val="20"/>
         </w:rPr>
-        <w:t xml:space="preserve">Foster Care Policy Database</w:t>
-      </w:r>
-      <w:r>
-        <w:rPr>
-          <w:rFonts w:ascii="Times New Roman" w:cs="Times New Roman" w:eastAsia="Times New Roman" w:hAnsi="Times New Roman"/>
-          <w:sz w:val="20"/>
-          <w:szCs w:val="20"/>
-        </w:rPr>
-        <w:t xml:space="preserve">, Washington University in St. Louis</w:t>
+        <w:t xml:space="preserve">Mindtrip</w:t>
       </w:r>
       <w:r>
         <w:rPr>
@@ -1045,7 +1321,7 @@
           <w:sz w:val="20"/>
           <w:szCs w:val="20"/>
         </w:rPr>
-        <w:t xml:space="preserve">Undergraduate Researcher</w:t>
+        <w:t xml:space="preserve">Software Engineer Intern</w:t>
       </w:r>
       <w:r>
         <w:tab/>
@@ -1056,7 +1332,7 @@
           <w:sz w:val="20"/>
           <w:szCs w:val="20"/>
         </w:rPr>
-        <w:t xml:space="preserve">Sep 2024 – May 2025</w:t>
+        <w:t xml:space="preserve">May – Jul 2023</w:t>
       </w:r>
     </w:p>
     <w:p>
@@ -1074,7 +1350,7 @@
           <w:sz w:val="20"/>
           <w:szCs w:val="20"/>
         </w:rPr>
-        <w:t xml:space="preserve">Fine-tuned LLaMA-3 with Hugging Face for QA over 50k foster-care policy documents, with human-in-the-loop feedback.</w:t>
+        <w:t xml:space="preserve">Built internal admin and secure-query tooling in JavaScript and Rails via Retool, saving roughly 250 engineering hours a month.</w:t>
       </w:r>
     </w:p>
     <w:p>
@@ -1093,54 +1369,7 @@
           <w:sz w:val="21"/>
           <w:szCs w:val="21"/>
         </w:rPr>
-        <w:t xml:space="preserve">EXPERIENCE</w:t>
-      </w:r>
-    </w:p>
-    <w:p>
-      <w:pPr>
-        <w:tabs>
-          <w:tab w:val="right" w:pos="10800"/>
-        </w:tabs>
-        <w:spacing w:before="42" w:line="235" w:lineRule="exact"/>
-      </w:pPr>
-      <w:r>
-        <w:rPr>
-          <w:rFonts w:ascii="Times New Roman" w:cs="Times New Roman" w:eastAsia="Times New Roman" w:hAnsi="Times New Roman"/>
-          <w:b/>
-          <w:bCs/>
-          <w:sz w:val="20"/>
-          <w:szCs w:val="20"/>
-        </w:rPr>
-        <w:t xml:space="preserve">Smack Technologies</w:t>
-      </w:r>
-      <w:r>
-        <w:rPr>
-          <w:rFonts w:ascii="Times New Roman" w:cs="Times New Roman" w:eastAsia="Times New Roman" w:hAnsi="Times New Roman"/>
-          <w:sz w:val="20"/>
-          <w:szCs w:val="20"/>
-        </w:rPr>
-        <w:t xml:space="preserve"> · </w:t>
-      </w:r>
-      <w:r>
-        <w:rPr>
-          <w:rFonts w:ascii="Times New Roman" w:cs="Times New Roman" w:eastAsia="Times New Roman" w:hAnsi="Times New Roman"/>
-          <w:i/>
-          <w:iCs/>
-          <w:sz w:val="20"/>
-          <w:szCs w:val="20"/>
-        </w:rPr>
-        <w:t xml:space="preserve">AI Intern</w:t>
-      </w:r>
-      <w:r>
-        <w:tab/>
-      </w:r>
-      <w:r>
-        <w:rPr>
-          <w:rFonts w:ascii="Times New Roman" w:cs="Times New Roman" w:eastAsia="Times New Roman" w:hAnsi="Times New Roman"/>
-          <w:sz w:val="20"/>
-          <w:szCs w:val="20"/>
-        </w:rPr>
-        <w:t xml:space="preserve">May – Aug 2026</w:t>
+        <w:t xml:space="preserve">COMPETITIONS &amp; LEADERSHIP</w:t>
       </w:r>
     </w:p>
     <w:p>
@@ -1155,10 +1384,90 @@
       <w:r>
         <w:rPr>
           <w:rFonts w:ascii="Times New Roman" w:cs="Times New Roman" w:eastAsia="Times New Roman" w:hAnsi="Times New Roman"/>
-          <w:sz w:val="20"/>
-          <w:szCs w:val="20"/>
-        </w:rPr>
-        <w:t xml:space="preserve">Built physics and sensor simulation, integrating the knowledge graph to expand corpus generation.</w:t>
+          <w:b/>
+          <w:bCs/>
+          <w:sz w:val="20"/>
+          <w:szCs w:val="20"/>
+        </w:rPr>
+        <w:t xml:space="preserve">Overall Winner</w:t>
+      </w:r>
+      <w:r>
+        <w:rPr>
+          <w:rFonts w:ascii="Times New Roman" w:cs="Times New Roman" w:eastAsia="Times New Roman" w:hAnsi="Times New Roman"/>
+          <w:sz w:val="20"/>
+          <w:szCs w:val="20"/>
+        </w:rPr>
+        <w:t xml:space="preserve"> &amp; </w:t>
+      </w:r>
+      <w:r>
+        <w:rPr>
+          <w:rFonts w:ascii="Times New Roman" w:cs="Times New Roman" w:eastAsia="Times New Roman" w:hAnsi="Times New Roman"/>
+          <w:b/>
+          <w:bCs/>
+          <w:sz w:val="20"/>
+          <w:szCs w:val="20"/>
+        </w:rPr>
+        <w:t xml:space="preserve">NVIDIA Ecosystem Award</w:t>
+      </w:r>
+      <w:r>
+        <w:rPr>
+          <w:rFonts w:ascii="Times New Roman" w:cs="Times New Roman" w:eastAsia="Times New Roman" w:hAnsi="Times New Roman"/>
+          <w:sz w:val="20"/>
+          <w:szCs w:val="20"/>
+        </w:rPr>
+        <w:t xml:space="preserve">, MIT iQuHACK 2026, qualified for the NYU Abu Dhabi Quantum and AI Hackathon 2027</w:t>
+      </w:r>
+      <w:r>
+        <w:rPr>
+          <w:rFonts w:ascii="Times New Roman" w:cs="Times New Roman" w:eastAsia="Times New Roman" w:hAnsi="Times New Roman"/>
+          <w:sz w:val="20"/>
+          <w:szCs w:val="20"/>
+        </w:rPr>
+        <w:t xml:space="preserve"> · </w:t>
+      </w:r>
+      <w:r>
+        <w:rPr>
+          <w:rFonts w:ascii="Times New Roman" w:cs="Times New Roman" w:eastAsia="Times New Roman" w:hAnsi="Times New Roman"/>
+          <w:b/>
+          <w:bCs/>
+          <w:sz w:val="20"/>
+          <w:szCs w:val="20"/>
+        </w:rPr>
+        <w:t xml:space="preserve">Audience Favorite</w:t>
+      </w:r>
+      <w:r>
+        <w:rPr>
+          <w:rFonts w:ascii="Times New Roman" w:cs="Times New Roman" w:eastAsia="Times New Roman" w:hAnsi="Times New Roman"/>
+          <w:sz w:val="20"/>
+          <w:szCs w:val="20"/>
+        </w:rPr>
+        <w:t xml:space="preserve">, Harmoniqs Quantum Design 2026</w:t>
+      </w:r>
+      <w:r>
+        <w:rPr>
+          <w:rFonts w:ascii="Times New Roman" w:cs="Times New Roman" w:eastAsia="Times New Roman" w:hAnsi="Times New Roman"/>
+          <w:sz w:val="20"/>
+          <w:szCs w:val="20"/>
+        </w:rPr>
+        <w:t xml:space="preserve"> · </w:t>
+      </w:r>
+      <w:r>
+        <w:rPr>
+          <w:rFonts w:ascii="Times New Roman" w:cs="Times New Roman" w:eastAsia="Times New Roman" w:hAnsi="Times New Roman"/>
+          <w:b/>
+          <w:bCs/>
+          <w:sz w:val="20"/>
+          <w:szCs w:val="20"/>
+        </w:rPr>
+        <w:t xml:space="preserve">Runner-Up</w:t>
+      </w:r>
+      <w:r>
+        <w:rPr>
+          <w:rFonts w:ascii="Times New Roman" w:cs="Times New Roman" w:eastAsia="Times New Roman" w:hAnsi="Times New Roman"/>
+          <w:sz w:val="20"/>
+          <w:szCs w:val="20"/>
+        </w:rPr>
+        <w:t xml:space="preserve">, Qualcomm Snapdragon Hackathon 2026</w:t>
       </w:r>
     </w:p>
     <w:p>
@@ -1173,158 +1482,20 @@
       <w:r>
         <w:rPr>
           <w:rFonts w:ascii="Times New Roman" w:cs="Times New Roman" w:eastAsia="Times New Roman" w:hAnsi="Times New Roman"/>
-          <w:sz w:val="20"/>
-          <w:szCs w:val="20"/>
-        </w:rPr>
-        <w:t xml:space="preserve">Benchmarked open-weight models head to head on speed, intelligence and concurrency, speeding corpus generation 64x.</w:t>
-      </w:r>
-    </w:p>
-    <w:p>
-      <w:pPr>
-        <w:pStyle w:val="ListParagraph"/>
-        <w:numPr>
-          <w:ilvl w:val="0"/>
-          <w:numId w:val="2"/>
-        </w:numPr>
-        <w:spacing w:before="12" w:line="235" w:lineRule="exact"/>
-      </w:pPr>
-      <w:r>
-        <w:rPr>
-          <w:rFonts w:ascii="Times New Roman" w:cs="Times New Roman" w:eastAsia="Times New Roman" w:hAnsi="Times New Roman"/>
-          <w:sz w:val="20"/>
-          <w:szCs w:val="20"/>
-        </w:rPr>
-        <w:t xml:space="preserve">Bounded simulator error to 0.55% against references outside its own tests, in a report that regenerates when the physics changes.</w:t>
-      </w:r>
-    </w:p>
-    <w:p>
-      <w:pPr>
-        <w:tabs>
-          <w:tab w:val="right" w:pos="10800"/>
-        </w:tabs>
-        <w:spacing w:before="54" w:line="235" w:lineRule="exact"/>
-      </w:pPr>
-      <w:r>
-        <w:rPr>
-          <w:rFonts w:ascii="Times New Roman" w:cs="Times New Roman" w:eastAsia="Times New Roman" w:hAnsi="Times New Roman"/>
-          <w:b/>
-          <w:bCs/>
-          <w:sz w:val="20"/>
-          <w:szCs w:val="20"/>
-        </w:rPr>
-        <w:t xml:space="preserve">Highnote</w:t>
-      </w:r>
-      <w:r>
-        <w:rPr>
-          <w:rFonts w:ascii="Times New Roman" w:cs="Times New Roman" w:eastAsia="Times New Roman" w:hAnsi="Times New Roman"/>
-          <w:sz w:val="20"/>
-          <w:szCs w:val="20"/>
-        </w:rPr>
-        <w:t xml:space="preserve"> · </w:t>
-      </w:r>
-      <w:r>
-        <w:rPr>
-          <w:rFonts w:ascii="Times New Roman" w:cs="Times New Roman" w:eastAsia="Times New Roman" w:hAnsi="Times New Roman"/>
-          <w:i/>
-          <w:iCs/>
-          <w:sz w:val="20"/>
-          <w:szCs w:val="20"/>
-        </w:rPr>
-        <w:t xml:space="preserve">Cybersecurity Engineer Intern</w:t>
-      </w:r>
-      <w:r>
-        <w:tab/>
-      </w:r>
-      <w:r>
-        <w:rPr>
-          <w:rFonts w:ascii="Times New Roman" w:cs="Times New Roman" w:eastAsia="Times New Roman" w:hAnsi="Times New Roman"/>
-          <w:sz w:val="20"/>
-          <w:szCs w:val="20"/>
-        </w:rPr>
-        <w:t xml:space="preserve">May – Jul 2024</w:t>
-      </w:r>
-    </w:p>
-    <w:p>
-      <w:pPr>
-        <w:pStyle w:val="ListParagraph"/>
-        <w:numPr>
-          <w:ilvl w:val="0"/>
-          <w:numId w:val="2"/>
-        </w:numPr>
-        <w:spacing w:before="12" w:line="235" w:lineRule="exact"/>
-      </w:pPr>
-      <w:r>
-        <w:rPr>
-          <w:rFonts w:ascii="Times New Roman" w:cs="Times New Roman" w:eastAsia="Times New Roman" w:hAnsi="Times New Roman"/>
-          <w:sz w:val="20"/>
-          <w:szCs w:val="20"/>
-        </w:rPr>
-        <w:t xml:space="preserve">Designed and deployed the company-wide SIEM for a card-issuing fintech, unifying AWS, GCP, and Datadog telemetry into one Elasticsearch cluster ingesting over 1 TB/day, and wrote 100+ rule-based and ML anomaly detections.</w:t>
-      </w:r>
-    </w:p>
-    <w:p>
-      <w:pPr>
-        <w:tabs>
-          <w:tab w:val="right" w:pos="10800"/>
-        </w:tabs>
-        <w:spacing w:before="54" w:line="235" w:lineRule="exact"/>
-      </w:pPr>
-      <w:r>
-        <w:rPr>
-          <w:rFonts w:ascii="Times New Roman" w:cs="Times New Roman" w:eastAsia="Times New Roman" w:hAnsi="Times New Roman"/>
-          <w:b/>
-          <w:bCs/>
-          <w:sz w:val="20"/>
-          <w:szCs w:val="20"/>
-        </w:rPr>
-        <w:t xml:space="preserve">Mindtrip</w:t>
-      </w:r>
-      <w:r>
-        <w:rPr>
-          <w:rFonts w:ascii="Times New Roman" w:cs="Times New Roman" w:eastAsia="Times New Roman" w:hAnsi="Times New Roman"/>
-          <w:sz w:val="20"/>
-          <w:szCs w:val="20"/>
-        </w:rPr>
-        <w:t xml:space="preserve"> · </w:t>
-      </w:r>
-      <w:r>
-        <w:rPr>
-          <w:rFonts w:ascii="Times New Roman" w:cs="Times New Roman" w:eastAsia="Times New Roman" w:hAnsi="Times New Roman"/>
-          <w:i/>
-          <w:iCs/>
-          <w:sz w:val="20"/>
-          <w:szCs w:val="20"/>
-        </w:rPr>
-        <w:t xml:space="preserve">Software Engineer Intern</w:t>
-      </w:r>
-      <w:r>
-        <w:tab/>
-      </w:r>
-      <w:r>
-        <w:rPr>
-          <w:rFonts w:ascii="Times New Roman" w:cs="Times New Roman" w:eastAsia="Times New Roman" w:hAnsi="Times New Roman"/>
-          <w:sz w:val="20"/>
-          <w:szCs w:val="20"/>
-        </w:rPr>
-        <w:t xml:space="preserve">May – Jul 2023</w:t>
-      </w:r>
-    </w:p>
-    <w:p>
-      <w:pPr>
-        <w:pStyle w:val="ListParagraph"/>
-        <w:numPr>
-          <w:ilvl w:val="0"/>
-          <w:numId w:val="2"/>
-        </w:numPr>
-        <w:spacing w:before="12" w:line="235" w:lineRule="exact"/>
-      </w:pPr>
-      <w:r>
-        <w:rPr>
-          <w:rFonts w:ascii="Times New Roman" w:cs="Times New Roman" w:eastAsia="Times New Roman" w:hAnsi="Times New Roman"/>
-          <w:sz w:val="20"/>
-          <w:szCs w:val="20"/>
-        </w:rPr>
-        <w:t xml:space="preserve">Built internal admin and secure-query tooling in JavaScript and Rails via Retool, saving roughly 250 engineering hours a month.</w:t>
+          <w:b/>
+          <w:bCs/>
+          <w:sz w:val="20"/>
+          <w:szCs w:val="20"/>
+        </w:rPr>
+        <w:t xml:space="preserve">Graduate Lead</w:t>
+      </w:r>
+      <w:r>
+        <w:rPr>
+          <w:rFonts w:ascii="Times New Roman" w:cs="Times New Roman" w:eastAsia="Times New Roman" w:hAnsi="Times New Roman"/>
+          <w:sz w:val="20"/>
+          <w:szCs w:val="20"/>
+        </w:rPr>
+        <w:t xml:space="preserve">, Columbia Quantum Algorithms Reading Group: weekly sessions through all 33 chapters of Andrew Childs' notes.</w:t>
       </w:r>
     </w:p>
     <w:p>
@@ -1343,151 +1514,6 @@
           <w:sz w:val="21"/>
           <w:szCs w:val="21"/>
         </w:rPr>
-        <w:t xml:space="preserve">COMPETITIONS &amp; LEADERSHIP</w:t>
-      </w:r>
-    </w:p>
-    <w:p>
-      <w:pPr>
-        <w:pStyle w:val="ListParagraph"/>
-        <w:numPr>
-          <w:ilvl w:val="0"/>
-          <w:numId w:val="2"/>
-        </w:numPr>
-        <w:spacing w:before="12" w:line="235" w:lineRule="exact"/>
-      </w:pPr>
-      <w:r>
-        <w:rPr>
-          <w:rFonts w:ascii="Times New Roman" w:cs="Times New Roman" w:eastAsia="Times New Roman" w:hAnsi="Times New Roman"/>
-          <w:b/>
-          <w:bCs/>
-          <w:sz w:val="20"/>
-          <w:szCs w:val="20"/>
-        </w:rPr>
-        <w:t xml:space="preserve">Overall Winner</w:t>
-      </w:r>
-      <w:r>
-        <w:rPr>
-          <w:rFonts w:ascii="Times New Roman" w:cs="Times New Roman" w:eastAsia="Times New Roman" w:hAnsi="Times New Roman"/>
-          <w:sz w:val="20"/>
-          <w:szCs w:val="20"/>
-        </w:rPr>
-        <w:t xml:space="preserve"> &amp; </w:t>
-      </w:r>
-      <w:r>
-        <w:rPr>
-          <w:rFonts w:ascii="Times New Roman" w:cs="Times New Roman" w:eastAsia="Times New Roman" w:hAnsi="Times New Roman"/>
-          <w:b/>
-          <w:bCs/>
-          <w:sz w:val="20"/>
-          <w:szCs w:val="20"/>
-        </w:rPr>
-        <w:t xml:space="preserve">NVIDIA Ecosystem Award</w:t>
-      </w:r>
-      <w:r>
-        <w:rPr>
-          <w:rFonts w:ascii="Times New Roman" w:cs="Times New Roman" w:eastAsia="Times New Roman" w:hAnsi="Times New Roman"/>
-          <w:sz w:val="20"/>
-          <w:szCs w:val="20"/>
-        </w:rPr>
-        <w:t xml:space="preserve">, MIT iQuHACK 2026, qualified for the NYU Abu Dhabi Quantum and AI Hackathon 2027</w:t>
-      </w:r>
-      <w:r>
-        <w:rPr>
-          <w:rFonts w:ascii="Times New Roman" w:cs="Times New Roman" w:eastAsia="Times New Roman" w:hAnsi="Times New Roman"/>
-          <w:sz w:val="20"/>
-          <w:szCs w:val="20"/>
-        </w:rPr>
-        <w:t xml:space="preserve"> · </w:t>
-      </w:r>
-      <w:r>
-        <w:rPr>
-          <w:rFonts w:ascii="Times New Roman" w:cs="Times New Roman" w:eastAsia="Times New Roman" w:hAnsi="Times New Roman"/>
-          <w:b/>
-          <w:bCs/>
-          <w:sz w:val="20"/>
-          <w:szCs w:val="20"/>
-        </w:rPr>
-        <w:t xml:space="preserve">Audience Favorite</w:t>
-      </w:r>
-      <w:r>
-        <w:rPr>
-          <w:rFonts w:ascii="Times New Roman" w:cs="Times New Roman" w:eastAsia="Times New Roman" w:hAnsi="Times New Roman"/>
-          <w:sz w:val="20"/>
-          <w:szCs w:val="20"/>
-        </w:rPr>
-        <w:t xml:space="preserve">, Harmoniqs Quantum Design 2026</w:t>
-      </w:r>
-      <w:r>
-        <w:rPr>
-          <w:rFonts w:ascii="Times New Roman" w:cs="Times New Roman" w:eastAsia="Times New Roman" w:hAnsi="Times New Roman"/>
-          <w:sz w:val="20"/>
-          <w:szCs w:val="20"/>
-        </w:rPr>
-        <w:t xml:space="preserve"> · </w:t>
-      </w:r>
-      <w:r>
-        <w:rPr>
-          <w:rFonts w:ascii="Times New Roman" w:cs="Times New Roman" w:eastAsia="Times New Roman" w:hAnsi="Times New Roman"/>
-          <w:b/>
-          <w:bCs/>
-          <w:sz w:val="20"/>
-          <w:szCs w:val="20"/>
-        </w:rPr>
-        <w:t xml:space="preserve">Runner-Up</w:t>
-      </w:r>
-      <w:r>
-        <w:rPr>
-          <w:rFonts w:ascii="Times New Roman" w:cs="Times New Roman" w:eastAsia="Times New Roman" w:hAnsi="Times New Roman"/>
-          <w:sz w:val="20"/>
-          <w:szCs w:val="20"/>
-        </w:rPr>
-        <w:t xml:space="preserve">, Qualcomm Snapdragon Hackathon 2026</w:t>
-      </w:r>
-    </w:p>
-    <w:p>
-      <w:pPr>
-        <w:pStyle w:val="ListParagraph"/>
-        <w:numPr>
-          <w:ilvl w:val="0"/>
-          <w:numId w:val="2"/>
-        </w:numPr>
-        <w:spacing w:before="12" w:line="235" w:lineRule="exact"/>
-      </w:pPr>
-      <w:r>
-        <w:rPr>
-          <w:rFonts w:ascii="Times New Roman" w:cs="Times New Roman" w:eastAsia="Times New Roman" w:hAnsi="Times New Roman"/>
-          <w:b/>
-          <w:bCs/>
-          <w:sz w:val="20"/>
-          <w:szCs w:val="20"/>
-        </w:rPr>
-        <w:t xml:space="preserve">Graduate Lead</w:t>
-      </w:r>
-      <w:r>
-        <w:rPr>
-          <w:rFonts w:ascii="Times New Roman" w:cs="Times New Roman" w:eastAsia="Times New Roman" w:hAnsi="Times New Roman"/>
-          <w:sz w:val="20"/>
-          <w:szCs w:val="20"/>
-        </w:rPr>
-        <w:t xml:space="preserve">, Columbia Quantum Algorithms Reading Group: weekly sessions through all 33 chapters of Andrew Childs' notes.</w:t>
-      </w:r>
-    </w:p>
-    <w:p>
-      <w:pPr>
-        <w:pBdr>
-          <w:bottom w:val="single" w:color="000000" w:sz="6" w:space="1"/>
-        </w:pBdr>
-        <w:spacing w:after="16" w:before="100" w:line="235" w:lineRule="exact"/>
-      </w:pPr>
-      <w:r>
-        <w:rPr>
-          <w:rFonts w:ascii="Times New Roman" w:cs="Times New Roman" w:eastAsia="Times New Roman" w:hAnsi="Times New Roman"/>
-          <w:b/>
-          <w:bCs/>
-          <w:spacing w:val="16"/>
-          <w:sz w:val="21"/>
-          <w:szCs w:val="21"/>
-        </w:rPr>
         <w:t xml:space="preserve">SKILLS</w:t>
       </w:r>
     </w:p>
@@ -1536,7 +1562,7 @@
           <w:sz w:val="20"/>
           <w:szCs w:val="20"/>
         </w:rPr>
-        <w:t xml:space="preserve">Hamiltonian simulation, phase and amplitude estimation, QSVT and block encoding, VQE, QAOA · surface codes, stabilizer formalism, MWPM and Union-Find decoding, threshold estimation, noise modeling</w:t>
+        <w:t xml:space="preserve">Hamiltonian simulation, phase and amplitude estimation, QSVT and block encoding, VQE, QAOA · surface codes, stabilizer formalism, MWPM and Union-Find decoding, threshold estimation, noise modeling, lattice surgery</w:t>
       </w:r>
     </w:p>
     <w:p>

</xml_diff>

<commit_message>
Lead with stabilizer-qec and ft-algorithms; one CV; readable hero links (#1)
Website work section led by stabilizer-qec and ft-algorithms (with a Shor-vs-distance demo); noise-aware and MPS into other work; hero buttons readable during the opening animation. Résumé: ft-algorithms replaces LLM compression. CV: two-page only, both technical reports added.

Co-Authored-By: Claude Opus 5.5 <noreply@anthropic.com>
Claude-Session: https://claude.ai/code/session_01B1JoCfzmbRMHJEkBTWzRWk
</commit_message>
<xml_diff>
--- a/resume/jaspersands_resume.docx
+++ b/resume/jaspersands_resume.docx
@@ -32,7 +32,7 @@
         </w:rPr>
         <w:t xml:space="preserve">Palo Alto, CA | +1 (650) 924-8429 | </w:t>
       </w:r>
-      <w:hyperlink w:history="1" r:id="rIdidgghvlsqlzl3vulwnf8n">
+      <w:hyperlink w:history="1" r:id="rIdblkcawvk6hpk_qoil5wvb">
         <w:r>
           <w:rPr>
             <w:rFonts w:ascii="Times New Roman" w:cs="Times New Roman" w:eastAsia="Times New Roman" w:hAnsi="Times New Roman"/>
@@ -50,7 +50,7 @@
         </w:rPr>
         <w:t xml:space="preserve"> | </w:t>
       </w:r>
-      <w:hyperlink w:history="1" r:id="rIdkmw_ncbanzi9ryvvyse9a">
+      <w:hyperlink w:history="1" r:id="rIdxettoj2shzvktrwwlewxl">
         <w:r>
           <w:rPr>
             <w:rFonts w:ascii="Times New Roman" w:cs="Times New Roman" w:eastAsia="Times New Roman" w:hAnsi="Times New Roman"/>
@@ -68,7 +68,7 @@
         </w:rPr>
         <w:t xml:space="preserve"> | </w:t>
       </w:r>
-      <w:hyperlink w:history="1" r:id="rId_tin4hxamhgeqcio5v_wx">
+      <w:hyperlink w:history="1" r:id="rId_s7vimouqfykjxxpzfftd">
         <w:r>
           <w:rPr>
             <w:rFonts w:ascii="Times New Roman" w:cs="Times New Roman" w:eastAsia="Times New Roman" w:hAnsi="Times New Roman"/>
@@ -86,7 +86,7 @@
         </w:rPr>
         <w:t xml:space="preserve"> | </w:t>
       </w:r>
-      <w:hyperlink w:history="1" r:id="rId18ucnucguozcvn7shc5gi">
+      <w:hyperlink w:history="1" r:id="rIdayzn0ucoznaxhfvuvz-zo">
         <w:r>
           <w:rPr>
             <w:rFonts w:ascii="Times New Roman" w:cs="Times New Roman" w:eastAsia="Times New Roman" w:hAnsi="Times New Roman"/>
@@ -108,7 +108,7 @@
           <w:sz w:val="20"/>
           <w:szCs w:val="20"/>
         </w:rPr>
-        <w:t xml:space="preserve">Quantum error correction, quantum algorithms, and machine learning for quantum-device characterization. MS in Computer Science at Columbia. Thesis at Diraq and UNSW Sydney on automating silicon spin qubit measurement.</w:t>
+        <w:t xml:space="preserve">Quantum error correction, fault-tolerant quantum algorithms, and machine learning for quantum-device characterization. MS in Computer Science at Columbia. Thesis at Diraq and UNSW Sydney on automating silicon spin qubit measurement.</w:t>
       </w:r>
     </w:p>
     <w:p>
@@ -427,9 +427,276 @@
         <w:tabs>
           <w:tab w:val="right" w:pos="10800"/>
         </w:tabs>
-        <w:spacing w:before="0" w:line="235" w:lineRule="exact"/>
-      </w:pPr>
-      <w:hyperlink w:history="1" r:id="rIdkrxj40tja8n4z3byrkxqc">
+        <w:spacing w:before="42" w:line="235" w:lineRule="exact"/>
+      </w:pPr>
+      <w:hyperlink w:history="1" r:id="rIdfehzwl8j06mowslqvlj2l">
+        <w:r>
+          <w:rPr>
+            <w:rFonts w:ascii="Times New Roman" w:cs="Times New Roman" w:eastAsia="Times New Roman" w:hAnsi="Times New Roman"/>
+            <w:b/>
+            <w:bCs/>
+            <w:sz w:val="20"/>
+            <w:szCs w:val="20"/>
+          </w:rPr>
+          <w:t xml:space="preserve">stabilizer-qec</w:t>
+        </w:r>
+      </w:hyperlink>
+      <w:r>
+        <w:rPr>
+          <w:rFonts w:ascii="Times New Roman" w:cs="Times New Roman" w:eastAsia="Times New Roman" w:hAnsi="Times New Roman"/>
+          <w:sz w:val="20"/>
+          <w:szCs w:val="20"/>
+        </w:rPr>
+        <w:t xml:space="preserve">: surface-code simulator and decoder</w:t>
+      </w:r>
+      <w:r>
+        <w:rPr>
+          <w:rFonts w:ascii="Times New Roman" w:cs="Times New Roman" w:eastAsia="Times New Roman" w:hAnsi="Times New Roman"/>
+          <w:sz w:val="20"/>
+          <w:szCs w:val="20"/>
+        </w:rPr>
+        <w:t xml:space="preserve"> · </w:t>
+      </w:r>
+      <w:r>
+        <w:rPr>
+          <w:rFonts w:ascii="Times New Roman" w:cs="Times New Roman" w:eastAsia="Times New Roman" w:hAnsi="Times New Roman"/>
+          <w:i/>
+          <w:iCs/>
+          <w:sz w:val="20"/>
+          <w:szCs w:val="20"/>
+        </w:rPr>
+        <w:t xml:space="preserve">Rust, Python, WebAssembly</w:t>
+      </w:r>
+      <w:r>
+        <w:tab/>
+      </w:r>
+      <w:hyperlink w:history="1" r:id="rIdfzhvdodelgoqxc0jqbd7p">
+        <w:r>
+          <w:rPr>
+            <w:rFonts w:ascii="Times New Roman" w:cs="Times New Roman" w:eastAsia="Times New Roman" w:hAnsi="Times New Roman"/>
+            <w:sz w:val="20"/>
+            <w:szCs w:val="20"/>
+          </w:rPr>
+          <w:t xml:space="preserve">qcompiler.jaspersands.com</w:t>
+        </w:r>
+      </w:hyperlink>
+    </w:p>
+    <w:p>
+      <w:pPr>
+        <w:pStyle w:val="ListParagraph"/>
+        <w:numPr>
+          <w:ilvl w:val="0"/>
+          <w:numId w:val="2"/>
+        </w:numPr>
+        <w:spacing w:before="12" w:line="235" w:lineRule="exact"/>
+      </w:pPr>
+      <w:r>
+        <w:rPr>
+          <w:rFonts w:ascii="Times New Roman" w:cs="Times New Roman" w:eastAsia="Times New Roman" w:hAnsi="Times New Roman"/>
+          <w:sz w:val="20"/>
+          <w:szCs w:val="20"/>
+        </w:rPr>
+        <w:t xml:space="preserve">Circuit-level simulator and decoders for surface, XZZX and IBM gross codes; matches Stim and PyMatching shot for shot.</w:t>
+      </w:r>
+    </w:p>
+    <w:p>
+      <w:pPr>
+        <w:pStyle w:val="ListParagraph"/>
+        <w:numPr>
+          <w:ilvl w:val="0"/>
+          <w:numId w:val="2"/>
+        </w:numPr>
+        <w:spacing w:before="12" w:line="235" w:lineRule="exact"/>
+      </w:pPr>
+      <w:r>
+        <w:rPr>
+          <w:rFonts w:ascii="Times New Roman" w:cs="Times New Roman" w:eastAsia="Times New Roman" w:hAnsi="Times New Roman"/>
+          <w:sz w:val="20"/>
+          <w:szCs w:val="20"/>
+        </w:rPr>
+        <w:t xml:space="preserve">Rebuilt Google's Willow and Sycamore experiments (27.5M shots) from raw measurements bit for bit and fitted Λ as Google does.</w:t>
+      </w:r>
+    </w:p>
+    <w:p>
+      <w:pPr>
+        <w:tabs>
+          <w:tab w:val="right" w:pos="10800"/>
+        </w:tabs>
+        <w:spacing w:before="54" w:line="235" w:lineRule="exact"/>
+      </w:pPr>
+      <w:hyperlink w:history="1" r:id="rIddpl5kfo07re3ok5jbulp8">
+        <w:r>
+          <w:rPr>
+            <w:rFonts w:ascii="Times New Roman" w:cs="Times New Roman" w:eastAsia="Times New Roman" w:hAnsi="Times New Roman"/>
+            <w:b/>
+            <w:bCs/>
+            <w:sz w:val="20"/>
+            <w:szCs w:val="20"/>
+          </w:rPr>
+          <w:t xml:space="preserve">ft-algorithms</w:t>
+        </w:r>
+      </w:hyperlink>
+      <w:r>
+        <w:rPr>
+          <w:rFonts w:ascii="Times New Roman" w:cs="Times New Roman" w:eastAsia="Times New Roman" w:hAnsi="Times New Roman"/>
+          <w:sz w:val="20"/>
+          <w:szCs w:val="20"/>
+        </w:rPr>
+        <w:t xml:space="preserve">: algorithms on a simulated fault-tolerant quantum computer</w:t>
+      </w:r>
+      <w:r>
+        <w:rPr>
+          <w:rFonts w:ascii="Times New Roman" w:cs="Times New Roman" w:eastAsia="Times New Roman" w:hAnsi="Times New Roman"/>
+          <w:sz w:val="20"/>
+          <w:szCs w:val="20"/>
+        </w:rPr>
+        <w:t xml:space="preserve"> · </w:t>
+      </w:r>
+      <w:r>
+        <w:rPr>
+          <w:rFonts w:ascii="Times New Roman" w:cs="Times New Roman" w:eastAsia="Times New Roman" w:hAnsi="Times New Roman"/>
+          <w:i/>
+          <w:iCs/>
+          <w:sz w:val="20"/>
+          <w:szCs w:val="20"/>
+        </w:rPr>
+        <w:t xml:space="preserve">Rust, Python</w:t>
+      </w:r>
+      <w:r>
+        <w:tab/>
+      </w:r>
+      <w:hyperlink w:history="1" r:id="rIdmr5wzwxhfh_1cqygxqbiw">
+        <w:r>
+          <w:rPr>
+            <w:rFonts w:ascii="Times New Roman" w:cs="Times New Roman" w:eastAsia="Times New Roman" w:hAnsi="Times New Roman"/>
+            <w:sz w:val="20"/>
+            <w:szCs w:val="20"/>
+          </w:rPr>
+          <w:t xml:space="preserve">ft.jaspersands.com</w:t>
+        </w:r>
+      </w:hyperlink>
+    </w:p>
+    <w:p>
+      <w:pPr>
+        <w:pStyle w:val="ListParagraph"/>
+        <w:numPr>
+          <w:ilvl w:val="0"/>
+          <w:numId w:val="2"/>
+        </w:numPr>
+        <w:spacing w:before="12" w:line="235" w:lineRule="exact"/>
+      </w:pPr>
+      <w:r>
+        <w:rPr>
+          <w:rFonts w:ascii="Times New Roman" w:cs="Times New Roman" w:eastAsia="Times New Roman" w:hAnsi="Times New Roman"/>
+          <w:sz w:val="20"/>
+          <w:szCs w:val="20"/>
+        </w:rPr>
+        <w:t xml:space="preserve">Runs Shor (N ≤ 143) and H₂/LiH phase estimation on a lattice-surgery machine fitted to 316 circuit-level QEC experiments.</w:t>
+      </w:r>
+    </w:p>
+    <w:p>
+      <w:pPr>
+        <w:pStyle w:val="ListParagraph"/>
+        <w:numPr>
+          <w:ilvl w:val="0"/>
+          <w:numId w:val="2"/>
+        </w:numPr>
+        <w:spacing w:before="12" w:line="235" w:lineRule="exact"/>
+      </w:pPr>
+      <w:r>
+        <w:rPr>
+          <w:rFonts w:ascii="Times New Roman" w:cs="Times New Roman" w:eastAsia="Times New Roman" w:hAnsi="Times New Roman"/>
+          <w:sz w:val="20"/>
+          <w:szCs w:val="20"/>
+        </w:rPr>
+        <w:t xml:space="preserve">Reproduces Gidney's 2025 RSA-2048 distance (d = 25) under his noise projection; measured noise needs d = 27–29.</w:t>
+      </w:r>
+    </w:p>
+    <w:p>
+      <w:pPr>
+        <w:tabs>
+          <w:tab w:val="right" w:pos="10800"/>
+        </w:tabs>
+        <w:spacing w:before="54" w:line="235" w:lineRule="exact"/>
+      </w:pPr>
+      <w:hyperlink w:history="1" r:id="rIdrhctlyxyc7emakhjsurew">
+        <w:r>
+          <w:rPr>
+            <w:rFonts w:ascii="Times New Roman" w:cs="Times New Roman" w:eastAsia="Times New Roman" w:hAnsi="Times New Roman"/>
+            <w:b/>
+            <w:bCs/>
+            <w:sz w:val="20"/>
+            <w:szCs w:val="20"/>
+          </w:rPr>
+          <w:t xml:space="preserve">Q-Search</w:t>
+        </w:r>
+      </w:hyperlink>
+      <w:r>
+        <w:rPr>
+          <w:rFonts w:ascii="Times New Roman" w:cs="Times New Roman" w:eastAsia="Times New Roman" w:hAnsi="Times New Roman"/>
+          <w:sz w:val="20"/>
+          <w:szCs w:val="20"/>
+        </w:rPr>
+        <w:t xml:space="preserve">: proof-gated quantum algorithm research and verification engine</w:t>
+      </w:r>
+      <w:r>
+        <w:tab/>
+      </w:r>
+      <w:hyperlink w:history="1" r:id="rIds9_smdszcx6pajyxn8edp">
+        <w:r>
+          <w:rPr>
+            <w:rFonts w:ascii="Times New Roman" w:cs="Times New Roman" w:eastAsia="Times New Roman" w:hAnsi="Times New Roman"/>
+            <w:sz w:val="20"/>
+            <w:szCs w:val="20"/>
+          </w:rPr>
+          <w:t xml:space="preserve">qsearch.jaspersands.com</w:t>
+        </w:r>
+      </w:hyperlink>
+    </w:p>
+    <w:p>
+      <w:pPr>
+        <w:pStyle w:val="ListParagraph"/>
+        <w:numPr>
+          <w:ilvl w:val="0"/>
+          <w:numId w:val="2"/>
+        </w:numPr>
+        <w:spacing w:before="12" w:line="235" w:lineRule="exact"/>
+      </w:pPr>
+      <w:r>
+        <w:rPr>
+          <w:rFonts w:ascii="Times New Roman" w:cs="Times New Roman" w:eastAsia="Times New Roman" w:hAnsi="Times New Roman"/>
+          <w:sz w:val="20"/>
+          <w:szCs w:val="20"/>
+        </w:rPr>
+        <w:t xml:space="preserve">Automated search for structural quantum advantage on non-abelian HSP, dihedral coset, and linear code equivalence problems.</w:t>
+      </w:r>
+    </w:p>
+    <w:p>
+      <w:pPr>
+        <w:pStyle w:val="ListParagraph"/>
+        <w:numPr>
+          <w:ilvl w:val="0"/>
+          <w:numId w:val="2"/>
+        </w:numPr>
+        <w:spacing w:before="12" w:line="235" w:lineRule="exact"/>
+      </w:pPr>
+      <w:r>
+        <w:rPr>
+          <w:rFonts w:ascii="Times New Roman" w:cs="Times New Roman" w:eastAsia="Times New Roman" w:hAnsi="Times New Roman"/>
+          <w:sz w:val="20"/>
+          <w:szCs w:val="20"/>
+        </w:rPr>
+        <w:t xml:space="preserve">Formal proof gates test each mechanism against 1,200+ classical baselines across 720+ theorem modules, indexing negative results.</w:t>
+      </w:r>
+    </w:p>
+    <w:p>
+      <w:pPr>
+        <w:tabs>
+          <w:tab w:val="right" w:pos="10800"/>
+        </w:tabs>
+        <w:spacing w:before="54" w:line="235" w:lineRule="exact"/>
+      </w:pPr>
+      <w:hyperlink w:history="1" r:id="rIdukoe4v0xdysj8loe_rkir">
         <w:r>
           <w:rPr>
             <w:rFonts w:ascii="Times New Roman" w:cs="Times New Roman" w:eastAsia="Times New Roman" w:hAnsi="Times New Roman"/>
@@ -476,7 +743,7 @@
           <w:sz w:val="20"/>
           <w:szCs w:val="20"/>
         </w:rPr>
-        <w:t xml:space="preserve"/>
+        <w:t xml:space="preserve">MIT iQuHACK 2026</w:t>
       </w:r>
     </w:p>
     <w:p>
@@ -517,30 +784,39 @@
     </w:p>
     <w:p>
       <w:pPr>
+        <w:pBdr>
+          <w:bottom w:val="single" w:color="000000" w:sz="6" w:space="1"/>
+        </w:pBdr>
+        <w:spacing w:after="16" w:before="100" w:line="235" w:lineRule="exact"/>
+      </w:pPr>
+      <w:r>
+        <w:rPr>
+          <w:rFonts w:ascii="Times New Roman" w:cs="Times New Roman" w:eastAsia="Times New Roman" w:hAnsi="Times New Roman"/>
+          <w:b/>
+          <w:bCs/>
+          <w:spacing w:val="16"/>
+          <w:sz w:val="21"/>
+          <w:szCs w:val="21"/>
+        </w:rPr>
+        <w:t xml:space="preserve">RESEARCH</w:t>
+      </w:r>
+    </w:p>
+    <w:p>
+      <w:pPr>
         <w:tabs>
           <w:tab w:val="right" w:pos="10800"/>
         </w:tabs>
-        <w:spacing w:before="54" w:line="235" w:lineRule="exact"/>
-      </w:pPr>
-      <w:hyperlink w:history="1" r:id="rIdqcc6zugkipr4ajqgoo3u9">
-        <w:r>
-          <w:rPr>
-            <w:rFonts w:ascii="Times New Roman" w:cs="Times New Roman" w:eastAsia="Times New Roman" w:hAnsi="Times New Roman"/>
-            <w:b/>
-            <w:bCs/>
-            <w:sz w:val="20"/>
-            <w:szCs w:val="20"/>
-          </w:rPr>
-          <w:t xml:space="preserve">WASM QEC Simulator</w:t>
-        </w:r>
-      </w:hyperlink>
-      <w:r>
-        <w:rPr>
-          <w:rFonts w:ascii="Times New Roman" w:cs="Times New Roman" w:eastAsia="Times New Roman" w:hAnsi="Times New Roman"/>
-          <w:sz w:val="20"/>
-          <w:szCs w:val="20"/>
-        </w:rPr>
-        <w:t xml:space="preserve">: surface-code decoding in the browser</w:t>
+        <w:spacing w:before="42" w:line="235" w:lineRule="exact"/>
+      </w:pPr>
+      <w:r>
+        <w:rPr>
+          <w:rFonts w:ascii="Times New Roman" w:cs="Times New Roman" w:eastAsia="Times New Roman" w:hAnsi="Times New Roman"/>
+          <w:b/>
+          <w:bCs/>
+          <w:sz w:val="20"/>
+          <w:szCs w:val="20"/>
+        </w:rPr>
+        <w:t xml:space="preserve">Diraq / UNSW Sydney</w:t>
       </w:r>
       <w:r>
         <w:rPr>
@@ -558,21 +834,19 @@
           <w:sz w:val="20"/>
           <w:szCs w:val="20"/>
         </w:rPr>
-        <w:t xml:space="preserve">Rust, WebAssembly</w:t>
+        <w:t xml:space="preserve">MS Thesis Research</w:t>
       </w:r>
       <w:r>
         <w:tab/>
       </w:r>
-      <w:hyperlink w:history="1" r:id="rIdfpnjeqfsqi_uvaay2pacs">
-        <w:r>
-          <w:rPr>
-            <w:rFonts w:ascii="Times New Roman" w:cs="Times New Roman" w:eastAsia="Times New Roman" w:hAnsi="Times New Roman"/>
-            <w:sz w:val="20"/>
-            <w:szCs w:val="20"/>
-          </w:rPr>
-          <w:t xml:space="preserve">qcompiler.jaspersands.com</w:t>
-        </w:r>
-      </w:hyperlink>
+      <w:r>
+        <w:rPr>
+          <w:rFonts w:ascii="Times New Roman" w:cs="Times New Roman" w:eastAsia="Times New Roman" w:hAnsi="Times New Roman"/>
+          <w:sz w:val="20"/>
+          <w:szCs w:val="20"/>
+        </w:rPr>
+        <w:t xml:space="preserve">Sep 2026 – May 2027</w:t>
+      </w:r>
     </w:p>
     <w:p>
       <w:pPr>
@@ -589,7 +863,7 @@
           <w:sz w:val="20"/>
           <w:szCs w:val="20"/>
         </w:rPr>
-        <w:t xml:space="preserve">Symplectic stabilizer simulator for rotated and XZZX surface codes, with exact MWPM and Union-Find decoding client-side.</w:t>
+        <w:t xml:space="preserve">Automating silicon spin qubit characterization under Dr. Nard Dumoulin Stuyck, replacing manual tuning and interpretation.</w:t>
       </w:r>
     </w:p>
     <w:p>
@@ -607,7 +881,7 @@
           <w:sz w:val="20"/>
           <w:szCs w:val="20"/>
         </w:rPr>
-        <w:t xml:space="preserve">Finite-size scaling puts the threshold at 3.2% with MWPM, 2.7% with Union-Find, and 14.7% under code-capacity noise.</w:t>
+        <w:t xml:space="preserve">Acquiring charge measurements from cryogenic probing, and classifying device states against what an expert would call by hand.</w:t>
       </w:r>
     </w:p>
     <w:p>
@@ -617,39 +891,53 @@
         </w:tabs>
         <w:spacing w:before="54" w:line="235" w:lineRule="exact"/>
       </w:pPr>
-      <w:hyperlink w:history="1" r:id="rIdis3pynkp9hnn9qkpc_v7x">
-        <w:r>
-          <w:rPr>
-            <w:rFonts w:ascii="Times New Roman" w:cs="Times New Roman" w:eastAsia="Times New Roman" w:hAnsi="Times New Roman"/>
-            <w:b/>
-            <w:bCs/>
-            <w:sz w:val="20"/>
-            <w:szCs w:val="20"/>
-          </w:rPr>
-          <w:t xml:space="preserve">Q-Search</w:t>
-        </w:r>
-      </w:hyperlink>
-      <w:r>
-        <w:rPr>
-          <w:rFonts w:ascii="Times New Roman" w:cs="Times New Roman" w:eastAsia="Times New Roman" w:hAnsi="Times New Roman"/>
-          <w:sz w:val="20"/>
-          <w:szCs w:val="20"/>
-        </w:rPr>
-        <w:t xml:space="preserve">: proof-gated quantum algorithm research and verification engine</w:t>
+      <w:r>
+        <w:rPr>
+          <w:rFonts w:ascii="Times New Roman" w:cs="Times New Roman" w:eastAsia="Times New Roman" w:hAnsi="Times New Roman"/>
+          <w:b/>
+          <w:bCs/>
+          <w:sz w:val="20"/>
+          <w:szCs w:val="20"/>
+        </w:rPr>
+        <w:t xml:space="preserve">Cidon Systems Research Lab</w:t>
+      </w:r>
+      <w:r>
+        <w:rPr>
+          <w:rFonts w:ascii="Times New Roman" w:cs="Times New Roman" w:eastAsia="Times New Roman" w:hAnsi="Times New Roman"/>
+          <w:sz w:val="20"/>
+          <w:szCs w:val="20"/>
+        </w:rPr>
+        <w:t xml:space="preserve">, Columbia University</w:t>
+      </w:r>
+      <w:r>
+        <w:rPr>
+          <w:rFonts w:ascii="Times New Roman" w:cs="Times New Roman" w:eastAsia="Times New Roman" w:hAnsi="Times New Roman"/>
+          <w:sz w:val="20"/>
+          <w:szCs w:val="20"/>
+        </w:rPr>
+        <w:t xml:space="preserve"> · </w:t>
+      </w:r>
+      <w:r>
+        <w:rPr>
+          <w:rFonts w:ascii="Times New Roman" w:cs="Times New Roman" w:eastAsia="Times New Roman" w:hAnsi="Times New Roman"/>
+          <w:i/>
+          <w:iCs/>
+          <w:sz w:val="20"/>
+          <w:szCs w:val="20"/>
+        </w:rPr>
+        <w:t xml:space="preserve">Graduate Researcher</w:t>
       </w:r>
       <w:r>
         <w:tab/>
       </w:r>
-      <w:hyperlink w:history="1" r:id="rId8xxvsbqsmdygebtl0evs3">
-        <w:r>
-          <w:rPr>
-            <w:rFonts w:ascii="Times New Roman" w:cs="Times New Roman" w:eastAsia="Times New Roman" w:hAnsi="Times New Roman"/>
-            <w:sz w:val="20"/>
-            <w:szCs w:val="20"/>
-          </w:rPr>
-          <w:t xml:space="preserve">qsearch.jaspersands.com</w:t>
-        </w:r>
-      </w:hyperlink>
+      <w:r>
+        <w:rPr>
+          <w:rFonts w:ascii="Times New Roman" w:cs="Times New Roman" w:eastAsia="Times New Roman" w:hAnsi="Times New Roman"/>
+          <w:sz w:val="20"/>
+          <w:szCs w:val="20"/>
+        </w:rPr>
+        <w:t xml:space="preserve">Sep 2025 – Jun 2026</w:t>
+      </w:r>
     </w:p>
     <w:p>
       <w:pPr>
@@ -666,7 +954,62 @@
           <w:sz w:val="20"/>
           <w:szCs w:val="20"/>
         </w:rPr>
-        <w:t xml:space="preserve">Automated search for structural quantum advantage on non-abelian HSP, dihedral coset, and linear code equivalence problems.</w:t>
+        <w:t xml:space="preserve">Built phishing and spam detection with Dr. Asaf Cidon and Barracuda Networks from LLM embeddings and email telemetry.</w:t>
+      </w:r>
+    </w:p>
+    <w:p>
+      <w:pPr>
+        <w:tabs>
+          <w:tab w:val="right" w:pos="10800"/>
+        </w:tabs>
+        <w:spacing w:before="54" w:line="235" w:lineRule="exact"/>
+      </w:pPr>
+      <w:r>
+        <w:rPr>
+          <w:rFonts w:ascii="Times New Roman" w:cs="Times New Roman" w:eastAsia="Times New Roman" w:hAnsi="Times New Roman"/>
+          <w:b/>
+          <w:bCs/>
+          <w:sz w:val="20"/>
+          <w:szCs w:val="20"/>
+        </w:rPr>
+        <w:t xml:space="preserve">Complex Resilient Intelligent Systems Lab</w:t>
+      </w:r>
+      <w:r>
+        <w:rPr>
+          <w:rFonts w:ascii="Times New Roman" w:cs="Times New Roman" w:eastAsia="Times New Roman" w:hAnsi="Times New Roman"/>
+          <w:sz w:val="20"/>
+          <w:szCs w:val="20"/>
+        </w:rPr>
+        <w:t xml:space="preserve">, Columbia University</w:t>
+      </w:r>
+      <w:r>
+        <w:rPr>
+          <w:rFonts w:ascii="Times New Roman" w:cs="Times New Roman" w:eastAsia="Times New Roman" w:hAnsi="Times New Roman"/>
+          <w:sz w:val="20"/>
+          <w:szCs w:val="20"/>
+        </w:rPr>
+        <w:t xml:space="preserve"> · </w:t>
+      </w:r>
+      <w:r>
+        <w:rPr>
+          <w:rFonts w:ascii="Times New Roman" w:cs="Times New Roman" w:eastAsia="Times New Roman" w:hAnsi="Times New Roman"/>
+          <w:i/>
+          <w:iCs/>
+          <w:sz w:val="20"/>
+          <w:szCs w:val="20"/>
+        </w:rPr>
+        <w:t xml:space="preserve">Graduate Researcher</w:t>
+      </w:r>
+      <w:r>
+        <w:tab/>
+      </w:r>
+      <w:r>
+        <w:rPr>
+          <w:rFonts w:ascii="Times New Roman" w:cs="Times New Roman" w:eastAsia="Times New Roman" w:hAnsi="Times New Roman"/>
+          <w:sz w:val="20"/>
+          <w:szCs w:val="20"/>
+        </w:rPr>
+        <w:t xml:space="preserve">May – Dec 2025</w:t>
       </w:r>
     </w:p>
     <w:p>
@@ -684,7 +1027,7 @@
           <w:sz w:val="20"/>
           <w:szCs w:val="20"/>
         </w:rPr>
-        <w:t xml:space="preserve">Formal proof gates test each mechanism against 1,200+ classical baselines across 720+ theorem modules, indexing negative results.</w:t>
+        <w:t xml:space="preserve">Reduced hallucination in generative protein modeling under Dr. Venkat Venkatasubramanian, grounded in molecular graph data.</w:t>
       </w:r>
     </w:p>
     <w:p>
@@ -694,18 +1037,24 @@
         </w:tabs>
         <w:spacing w:before="54" w:line="235" w:lineRule="exact"/>
       </w:pPr>
-      <w:hyperlink w:history="1" r:id="rIdjhsc93ujxysyloa1yi3nk">
-        <w:r>
-          <w:rPr>
-            <w:rFonts w:ascii="Times New Roman" w:cs="Times New Roman" w:eastAsia="Times New Roman" w:hAnsi="Times New Roman"/>
-            <w:b/>
-            <w:bCs/>
-            <w:sz w:val="20"/>
-            <w:szCs w:val="20"/>
-          </w:rPr>
-          <w:t xml:space="preserve">LLM-Based Lossless Text Compression</w:t>
-        </w:r>
-      </w:hyperlink>
+      <w:r>
+        <w:rPr>
+          <w:rFonts w:ascii="Times New Roman" w:cs="Times New Roman" w:eastAsia="Times New Roman" w:hAnsi="Times New Roman"/>
+          <w:b/>
+          <w:bCs/>
+          <w:sz w:val="20"/>
+          <w:szCs w:val="20"/>
+        </w:rPr>
+        <w:t xml:space="preserve">Foster Care Policy Database</w:t>
+      </w:r>
+      <w:r>
+        <w:rPr>
+          <w:rFonts w:ascii="Times New Roman" w:cs="Times New Roman" w:eastAsia="Times New Roman" w:hAnsi="Times New Roman"/>
+          <w:sz w:val="20"/>
+          <w:szCs w:val="20"/>
+        </w:rPr>
+        <w:t xml:space="preserve">, Washington University in St. Louis</w:t>
+      </w:r>
       <w:r>
         <w:rPr>
           <w:rFonts w:ascii="Times New Roman" w:cs="Times New Roman" w:eastAsia="Times New Roman" w:hAnsi="Times New Roman"/>
@@ -722,21 +1071,19 @@
           <w:sz w:val="20"/>
           <w:szCs w:val="20"/>
         </w:rPr>
-        <w:t xml:space="preserve">PyTorch, CUDA</w:t>
+        <w:t xml:space="preserve">Undergraduate Researcher</w:t>
       </w:r>
       <w:r>
         <w:tab/>
       </w:r>
-      <w:hyperlink w:history="1" r:id="rIdd6m0k-lma_fmtwxdwaenm">
-        <w:r>
-          <w:rPr>
-            <w:rFonts w:ascii="Times New Roman" w:cs="Times New Roman" w:eastAsia="Times New Roman" w:hAnsi="Times New Roman"/>
-            <w:sz w:val="20"/>
-            <w:szCs w:val="20"/>
-          </w:rPr>
-          <w:t xml:space="preserve">jaspersands.com/llmcompression</w:t>
-        </w:r>
-      </w:hyperlink>
+      <w:r>
+        <w:rPr>
+          <w:rFonts w:ascii="Times New Roman" w:cs="Times New Roman" w:eastAsia="Times New Roman" w:hAnsi="Times New Roman"/>
+          <w:sz w:val="20"/>
+          <w:szCs w:val="20"/>
+        </w:rPr>
+        <w:t xml:space="preserve">Sep 2024 – May 2025</w:t>
+      </w:r>
     </w:p>
     <w:p>
       <w:pPr>
@@ -753,7 +1100,7 @@
           <w:sz w:val="20"/>
           <w:szCs w:val="20"/>
         </w:rPr>
-        <w:t xml:space="preserve">Arithmetic coding on LLM predictions, 5–16× average and 39× best case, at 100–1000× lower throughput than gzip and zstd.</w:t>
+        <w:t xml:space="preserve">Fine-tuned LLaMA-3 with Hugging Face for QA over 50k foster-care policy documents, with human-in-the-loop feedback.</w:t>
       </w:r>
     </w:p>
     <w:p>
@@ -772,7 +1119,7 @@
           <w:sz w:val="21"/>
           <w:szCs w:val="21"/>
         </w:rPr>
-        <w:t xml:space="preserve">RESEARCH</w:t>
+        <w:t xml:space="preserve">EXPERIENCE</w:t>
       </w:r>
     </w:p>
     <w:p>
@@ -790,7 +1137,7 @@
           <w:sz w:val="20"/>
           <w:szCs w:val="20"/>
         </w:rPr>
-        <w:t xml:space="preserve">Diraq / UNSW Sydney</w:t>
+        <w:t xml:space="preserve">Smack Technologies</w:t>
       </w:r>
       <w:r>
         <w:rPr>
@@ -808,7 +1155,7 @@
           <w:sz w:val="20"/>
           <w:szCs w:val="20"/>
         </w:rPr>
-        <w:t xml:space="preserve">MS Thesis Research</w:t>
+        <w:t xml:space="preserve">AI Intern</w:t>
       </w:r>
       <w:r>
         <w:tab/>
@@ -819,7 +1166,7 @@
           <w:sz w:val="20"/>
           <w:szCs w:val="20"/>
         </w:rPr>
-        <w:t xml:space="preserve">Sep 2026 – May 2027</w:t>
+        <w:t xml:space="preserve">May – Aug 2026</w:t>
       </w:r>
     </w:p>
     <w:p>
@@ -837,7 +1184,7 @@
           <w:sz w:val="20"/>
           <w:szCs w:val="20"/>
         </w:rPr>
-        <w:t xml:space="preserve">Automating silicon spin qubit characterization under Dr. Nard Dumoulin Stuyck, replacing manual tuning and interpretation.</w:t>
+        <w:t xml:space="preserve">Built physics and sensor simulation, integrating the knowledge graph to expand corpus generation.</w:t>
       </w:r>
     </w:p>
     <w:p>
@@ -855,62 +1202,7 @@
           <w:sz w:val="20"/>
           <w:szCs w:val="20"/>
         </w:rPr>
-        <w:t xml:space="preserve">Acquiring charge measurements from cryogenic probing, and classifying device states against what an expert would call by hand.</w:t>
-      </w:r>
-    </w:p>
-    <w:p>
-      <w:pPr>
-        <w:tabs>
-          <w:tab w:val="right" w:pos="10800"/>
-        </w:tabs>
-        <w:spacing w:before="54" w:line="235" w:lineRule="exact"/>
-      </w:pPr>
-      <w:r>
-        <w:rPr>
-          <w:rFonts w:ascii="Times New Roman" w:cs="Times New Roman" w:eastAsia="Times New Roman" w:hAnsi="Times New Roman"/>
-          <w:b/>
-          <w:bCs/>
-          <w:sz w:val="20"/>
-          <w:szCs w:val="20"/>
-        </w:rPr>
-        <w:t xml:space="preserve">Cidon Systems Research Lab</w:t>
-      </w:r>
-      <w:r>
-        <w:rPr>
-          <w:rFonts w:ascii="Times New Roman" w:cs="Times New Roman" w:eastAsia="Times New Roman" w:hAnsi="Times New Roman"/>
-          <w:sz w:val="20"/>
-          <w:szCs w:val="20"/>
-        </w:rPr>
-        <w:t xml:space="preserve">, Columbia University</w:t>
-      </w:r>
-      <w:r>
-        <w:rPr>
-          <w:rFonts w:ascii="Times New Roman" w:cs="Times New Roman" w:eastAsia="Times New Roman" w:hAnsi="Times New Roman"/>
-          <w:sz w:val="20"/>
-          <w:szCs w:val="20"/>
-        </w:rPr>
-        <w:t xml:space="preserve"> · </w:t>
-      </w:r>
-      <w:r>
-        <w:rPr>
-          <w:rFonts w:ascii="Times New Roman" w:cs="Times New Roman" w:eastAsia="Times New Roman" w:hAnsi="Times New Roman"/>
-          <w:i/>
-          <w:iCs/>
-          <w:sz w:val="20"/>
-          <w:szCs w:val="20"/>
-        </w:rPr>
-        <w:t xml:space="preserve">Graduate Researcher</w:t>
-      </w:r>
-      <w:r>
-        <w:tab/>
-      </w:r>
-      <w:r>
-        <w:rPr>
-          <w:rFonts w:ascii="Times New Roman" w:cs="Times New Roman" w:eastAsia="Times New Roman" w:hAnsi="Times New Roman"/>
-          <w:sz w:val="20"/>
-          <w:szCs w:val="20"/>
-        </w:rPr>
-        <w:t xml:space="preserve">Sep 2025 – Jun 2026</w:t>
+        <w:t xml:space="preserve">Benchmarked open-weight models head to head on speed, intelligence and concurrency, speeding corpus generation 64x.</w:t>
       </w:r>
     </w:p>
     <w:p>
@@ -928,7 +1220,7 @@
           <w:sz w:val="20"/>
           <w:szCs w:val="20"/>
         </w:rPr>
-        <w:t xml:space="preserve">Built phishing and spam detection pipelines with Dr. Asaf Cidon and Barracuda Networks, combining language-model embeddings with production email telemetry and tuning for precision against a fixed false-positive budget.</w:t>
+        <w:t xml:space="preserve">Bounded simulator error to 0.55% against references outside its own tests, in a report that regenerates when the physics changes.</w:t>
       </w:r>
     </w:p>
     <w:p>
@@ -946,15 +1238,7 @@
           <w:sz w:val="20"/>
           <w:szCs w:val="20"/>
         </w:rPr>
-        <w:t xml:space="preserve">Complex Resilient Intelligent Systems Lab</w:t>
-      </w:r>
-      <w:r>
-        <w:rPr>
-          <w:rFonts w:ascii="Times New Roman" w:cs="Times New Roman" w:eastAsia="Times New Roman" w:hAnsi="Times New Roman"/>
-          <w:sz w:val="20"/>
-          <w:szCs w:val="20"/>
-        </w:rPr>
-        <w:t xml:space="preserve">, Columbia University</w:t>
+        <w:t xml:space="preserve">Highnote</w:t>
       </w:r>
       <w:r>
         <w:rPr>
@@ -972,7 +1256,7 @@
           <w:sz w:val="20"/>
           <w:szCs w:val="20"/>
         </w:rPr>
-        <w:t xml:space="preserve">Graduate Researcher</w:t>
+        <w:t xml:space="preserve">Cybersecurity Engineer Intern</w:t>
       </w:r>
       <w:r>
         <w:tab/>
@@ -983,7 +1267,7 @@
           <w:sz w:val="20"/>
           <w:szCs w:val="20"/>
         </w:rPr>
-        <w:t xml:space="preserve">May – Dec 2025</w:t>
+        <w:t xml:space="preserve">May – Jul 2024</w:t>
       </w:r>
     </w:p>
     <w:p>
@@ -1001,7 +1285,7 @@
           <w:sz w:val="20"/>
           <w:szCs w:val="20"/>
         </w:rPr>
-        <w:t xml:space="preserve">Reduced hallucination in generative protein modeling under Dr. Venkat Venkatasubramanian, grounded in molecular graph data.</w:t>
+        <w:t xml:space="preserve">Built the company-wide SIEM for a card-issuing fintech: AWS, GCP and Datadog logs in one Elasticsearch cluster (1 TB/day), 100+ detections.</w:t>
       </w:r>
     </w:p>
     <w:p>
@@ -1019,15 +1303,7 @@
           <w:sz w:val="20"/>
           <w:szCs w:val="20"/>
         </w:rPr>
-        <w:t xml:space="preserve">Foster Care Policy Database</w:t>
-      </w:r>
-      <w:r>
-        <w:rPr>
-          <w:rFonts w:ascii="Times New Roman" w:cs="Times New Roman" w:eastAsia="Times New Roman" w:hAnsi="Times New Roman"/>
-          <w:sz w:val="20"/>
-          <w:szCs w:val="20"/>
-        </w:rPr>
-        <w:t xml:space="preserve">, Washington University in St. Louis</w:t>
+        <w:t xml:space="preserve">Mindtrip</w:t>
       </w:r>
       <w:r>
         <w:rPr>
@@ -1045,7 +1321,7 @@
           <w:sz w:val="20"/>
           <w:szCs w:val="20"/>
         </w:rPr>
-        <w:t xml:space="preserve">Undergraduate Researcher</w:t>
+        <w:t xml:space="preserve">Software Engineer Intern</w:t>
       </w:r>
       <w:r>
         <w:tab/>
@@ -1056,7 +1332,7 @@
           <w:sz w:val="20"/>
           <w:szCs w:val="20"/>
         </w:rPr>
-        <w:t xml:space="preserve">Sep 2024 – May 2025</w:t>
+        <w:t xml:space="preserve">May – Jul 2023</w:t>
       </w:r>
     </w:p>
     <w:p>
@@ -1074,7 +1350,7 @@
           <w:sz w:val="20"/>
           <w:szCs w:val="20"/>
         </w:rPr>
-        <w:t xml:space="preserve">Fine-tuned LLaMA-3 with Hugging Face for QA over 50k foster-care policy documents, with human-in-the-loop feedback.</w:t>
+        <w:t xml:space="preserve">Built internal admin and secure-query tooling in JavaScript and Rails via Retool, saving roughly 250 engineering hours a month.</w:t>
       </w:r>
     </w:p>
     <w:p>
@@ -1093,54 +1369,7 @@
           <w:sz w:val="21"/>
           <w:szCs w:val="21"/>
         </w:rPr>
-        <w:t xml:space="preserve">EXPERIENCE</w:t>
-      </w:r>
-    </w:p>
-    <w:p>
-      <w:pPr>
-        <w:tabs>
-          <w:tab w:val="right" w:pos="10800"/>
-        </w:tabs>
-        <w:spacing w:before="42" w:line="235" w:lineRule="exact"/>
-      </w:pPr>
-      <w:r>
-        <w:rPr>
-          <w:rFonts w:ascii="Times New Roman" w:cs="Times New Roman" w:eastAsia="Times New Roman" w:hAnsi="Times New Roman"/>
-          <w:b/>
-          <w:bCs/>
-          <w:sz w:val="20"/>
-          <w:szCs w:val="20"/>
-        </w:rPr>
-        <w:t xml:space="preserve">Smack Technologies</w:t>
-      </w:r>
-      <w:r>
-        <w:rPr>
-          <w:rFonts w:ascii="Times New Roman" w:cs="Times New Roman" w:eastAsia="Times New Roman" w:hAnsi="Times New Roman"/>
-          <w:sz w:val="20"/>
-          <w:szCs w:val="20"/>
-        </w:rPr>
-        <w:t xml:space="preserve"> · </w:t>
-      </w:r>
-      <w:r>
-        <w:rPr>
-          <w:rFonts w:ascii="Times New Roman" w:cs="Times New Roman" w:eastAsia="Times New Roman" w:hAnsi="Times New Roman"/>
-          <w:i/>
-          <w:iCs/>
-          <w:sz w:val="20"/>
-          <w:szCs w:val="20"/>
-        </w:rPr>
-        <w:t xml:space="preserve">AI Intern</w:t>
-      </w:r>
-      <w:r>
-        <w:tab/>
-      </w:r>
-      <w:r>
-        <w:rPr>
-          <w:rFonts w:ascii="Times New Roman" w:cs="Times New Roman" w:eastAsia="Times New Roman" w:hAnsi="Times New Roman"/>
-          <w:sz w:val="20"/>
-          <w:szCs w:val="20"/>
-        </w:rPr>
-        <w:t xml:space="preserve">May – Aug 2026</w:t>
+        <w:t xml:space="preserve">COMPETITIONS &amp; LEADERSHIP</w:t>
       </w:r>
     </w:p>
     <w:p>
@@ -1155,10 +1384,90 @@
       <w:r>
         <w:rPr>
           <w:rFonts w:ascii="Times New Roman" w:cs="Times New Roman" w:eastAsia="Times New Roman" w:hAnsi="Times New Roman"/>
-          <w:sz w:val="20"/>
-          <w:szCs w:val="20"/>
-        </w:rPr>
-        <w:t xml:space="preserve">Built physics and sensor simulation, integrating the knowledge graph to expand corpus generation.</w:t>
+          <w:b/>
+          <w:bCs/>
+          <w:sz w:val="20"/>
+          <w:szCs w:val="20"/>
+        </w:rPr>
+        <w:t xml:space="preserve">Overall Winner</w:t>
+      </w:r>
+      <w:r>
+        <w:rPr>
+          <w:rFonts w:ascii="Times New Roman" w:cs="Times New Roman" w:eastAsia="Times New Roman" w:hAnsi="Times New Roman"/>
+          <w:sz w:val="20"/>
+          <w:szCs w:val="20"/>
+        </w:rPr>
+        <w:t xml:space="preserve"> &amp; </w:t>
+      </w:r>
+      <w:r>
+        <w:rPr>
+          <w:rFonts w:ascii="Times New Roman" w:cs="Times New Roman" w:eastAsia="Times New Roman" w:hAnsi="Times New Roman"/>
+          <w:b/>
+          <w:bCs/>
+          <w:sz w:val="20"/>
+          <w:szCs w:val="20"/>
+        </w:rPr>
+        <w:t xml:space="preserve">NVIDIA Ecosystem Award</w:t>
+      </w:r>
+      <w:r>
+        <w:rPr>
+          <w:rFonts w:ascii="Times New Roman" w:cs="Times New Roman" w:eastAsia="Times New Roman" w:hAnsi="Times New Roman"/>
+          <w:sz w:val="20"/>
+          <w:szCs w:val="20"/>
+        </w:rPr>
+        <w:t xml:space="preserve">, MIT iQuHACK 2026, qualified for the NYU Abu Dhabi Quantum and AI Hackathon 2027</w:t>
+      </w:r>
+      <w:r>
+        <w:rPr>
+          <w:rFonts w:ascii="Times New Roman" w:cs="Times New Roman" w:eastAsia="Times New Roman" w:hAnsi="Times New Roman"/>
+          <w:sz w:val="20"/>
+          <w:szCs w:val="20"/>
+        </w:rPr>
+        <w:t xml:space="preserve"> · </w:t>
+      </w:r>
+      <w:r>
+        <w:rPr>
+          <w:rFonts w:ascii="Times New Roman" w:cs="Times New Roman" w:eastAsia="Times New Roman" w:hAnsi="Times New Roman"/>
+          <w:b/>
+          <w:bCs/>
+          <w:sz w:val="20"/>
+          <w:szCs w:val="20"/>
+        </w:rPr>
+        <w:t xml:space="preserve">Audience Favorite</w:t>
+      </w:r>
+      <w:r>
+        <w:rPr>
+          <w:rFonts w:ascii="Times New Roman" w:cs="Times New Roman" w:eastAsia="Times New Roman" w:hAnsi="Times New Roman"/>
+          <w:sz w:val="20"/>
+          <w:szCs w:val="20"/>
+        </w:rPr>
+        <w:t xml:space="preserve">, Harmoniqs Quantum Design 2026</w:t>
+      </w:r>
+      <w:r>
+        <w:rPr>
+          <w:rFonts w:ascii="Times New Roman" w:cs="Times New Roman" w:eastAsia="Times New Roman" w:hAnsi="Times New Roman"/>
+          <w:sz w:val="20"/>
+          <w:szCs w:val="20"/>
+        </w:rPr>
+        <w:t xml:space="preserve"> · </w:t>
+      </w:r>
+      <w:r>
+        <w:rPr>
+          <w:rFonts w:ascii="Times New Roman" w:cs="Times New Roman" w:eastAsia="Times New Roman" w:hAnsi="Times New Roman"/>
+          <w:b/>
+          <w:bCs/>
+          <w:sz w:val="20"/>
+          <w:szCs w:val="20"/>
+        </w:rPr>
+        <w:t xml:space="preserve">Runner-Up</w:t>
+      </w:r>
+      <w:r>
+        <w:rPr>
+          <w:rFonts w:ascii="Times New Roman" w:cs="Times New Roman" w:eastAsia="Times New Roman" w:hAnsi="Times New Roman"/>
+          <w:sz w:val="20"/>
+          <w:szCs w:val="20"/>
+        </w:rPr>
+        <w:t xml:space="preserve">, Qualcomm Snapdragon Hackathon 2026</w:t>
       </w:r>
     </w:p>
     <w:p>
@@ -1173,158 +1482,20 @@
       <w:r>
         <w:rPr>
           <w:rFonts w:ascii="Times New Roman" w:cs="Times New Roman" w:eastAsia="Times New Roman" w:hAnsi="Times New Roman"/>
-          <w:sz w:val="20"/>
-          <w:szCs w:val="20"/>
-        </w:rPr>
-        <w:t xml:space="preserve">Benchmarked open-weight models head to head on speed, intelligence and concurrency, speeding corpus generation 64x.</w:t>
-      </w:r>
-    </w:p>
-    <w:p>
-      <w:pPr>
-        <w:pStyle w:val="ListParagraph"/>
-        <w:numPr>
-          <w:ilvl w:val="0"/>
-          <w:numId w:val="2"/>
-        </w:numPr>
-        <w:spacing w:before="12" w:line="235" w:lineRule="exact"/>
-      </w:pPr>
-      <w:r>
-        <w:rPr>
-          <w:rFonts w:ascii="Times New Roman" w:cs="Times New Roman" w:eastAsia="Times New Roman" w:hAnsi="Times New Roman"/>
-          <w:sz w:val="20"/>
-          <w:szCs w:val="20"/>
-        </w:rPr>
-        <w:t xml:space="preserve">Bounded simulator error to 0.55% against references outside its own tests, in a report that regenerates when the physics changes.</w:t>
-      </w:r>
-    </w:p>
-    <w:p>
-      <w:pPr>
-        <w:tabs>
-          <w:tab w:val="right" w:pos="10800"/>
-        </w:tabs>
-        <w:spacing w:before="54" w:line="235" w:lineRule="exact"/>
-      </w:pPr>
-      <w:r>
-        <w:rPr>
-          <w:rFonts w:ascii="Times New Roman" w:cs="Times New Roman" w:eastAsia="Times New Roman" w:hAnsi="Times New Roman"/>
-          <w:b/>
-          <w:bCs/>
-          <w:sz w:val="20"/>
-          <w:szCs w:val="20"/>
-        </w:rPr>
-        <w:t xml:space="preserve">Highnote</w:t>
-      </w:r>
-      <w:r>
-        <w:rPr>
-          <w:rFonts w:ascii="Times New Roman" w:cs="Times New Roman" w:eastAsia="Times New Roman" w:hAnsi="Times New Roman"/>
-          <w:sz w:val="20"/>
-          <w:szCs w:val="20"/>
-        </w:rPr>
-        <w:t xml:space="preserve"> · </w:t>
-      </w:r>
-      <w:r>
-        <w:rPr>
-          <w:rFonts w:ascii="Times New Roman" w:cs="Times New Roman" w:eastAsia="Times New Roman" w:hAnsi="Times New Roman"/>
-          <w:i/>
-          <w:iCs/>
-          <w:sz w:val="20"/>
-          <w:szCs w:val="20"/>
-        </w:rPr>
-        <w:t xml:space="preserve">Cybersecurity Engineer Intern</w:t>
-      </w:r>
-      <w:r>
-        <w:tab/>
-      </w:r>
-      <w:r>
-        <w:rPr>
-          <w:rFonts w:ascii="Times New Roman" w:cs="Times New Roman" w:eastAsia="Times New Roman" w:hAnsi="Times New Roman"/>
-          <w:sz w:val="20"/>
-          <w:szCs w:val="20"/>
-        </w:rPr>
-        <w:t xml:space="preserve">May – Jul 2024</w:t>
-      </w:r>
-    </w:p>
-    <w:p>
-      <w:pPr>
-        <w:pStyle w:val="ListParagraph"/>
-        <w:numPr>
-          <w:ilvl w:val="0"/>
-          <w:numId w:val="2"/>
-        </w:numPr>
-        <w:spacing w:before="12" w:line="235" w:lineRule="exact"/>
-      </w:pPr>
-      <w:r>
-        <w:rPr>
-          <w:rFonts w:ascii="Times New Roman" w:cs="Times New Roman" w:eastAsia="Times New Roman" w:hAnsi="Times New Roman"/>
-          <w:sz w:val="20"/>
-          <w:szCs w:val="20"/>
-        </w:rPr>
-        <w:t xml:space="preserve">Designed and deployed the company-wide SIEM for a card-issuing fintech, unifying AWS, GCP, and Datadog telemetry into one Elasticsearch cluster ingesting over 1 TB/day, and wrote 100+ rule-based and ML anomaly detections.</w:t>
-      </w:r>
-    </w:p>
-    <w:p>
-      <w:pPr>
-        <w:tabs>
-          <w:tab w:val="right" w:pos="10800"/>
-        </w:tabs>
-        <w:spacing w:before="54" w:line="235" w:lineRule="exact"/>
-      </w:pPr>
-      <w:r>
-        <w:rPr>
-          <w:rFonts w:ascii="Times New Roman" w:cs="Times New Roman" w:eastAsia="Times New Roman" w:hAnsi="Times New Roman"/>
-          <w:b/>
-          <w:bCs/>
-          <w:sz w:val="20"/>
-          <w:szCs w:val="20"/>
-        </w:rPr>
-        <w:t xml:space="preserve">Mindtrip</w:t>
-      </w:r>
-      <w:r>
-        <w:rPr>
-          <w:rFonts w:ascii="Times New Roman" w:cs="Times New Roman" w:eastAsia="Times New Roman" w:hAnsi="Times New Roman"/>
-          <w:sz w:val="20"/>
-          <w:szCs w:val="20"/>
-        </w:rPr>
-        <w:t xml:space="preserve"> · </w:t>
-      </w:r>
-      <w:r>
-        <w:rPr>
-          <w:rFonts w:ascii="Times New Roman" w:cs="Times New Roman" w:eastAsia="Times New Roman" w:hAnsi="Times New Roman"/>
-          <w:i/>
-          <w:iCs/>
-          <w:sz w:val="20"/>
-          <w:szCs w:val="20"/>
-        </w:rPr>
-        <w:t xml:space="preserve">Software Engineer Intern</w:t>
-      </w:r>
-      <w:r>
-        <w:tab/>
-      </w:r>
-      <w:r>
-        <w:rPr>
-          <w:rFonts w:ascii="Times New Roman" w:cs="Times New Roman" w:eastAsia="Times New Roman" w:hAnsi="Times New Roman"/>
-          <w:sz w:val="20"/>
-          <w:szCs w:val="20"/>
-        </w:rPr>
-        <w:t xml:space="preserve">May – Jul 2023</w:t>
-      </w:r>
-    </w:p>
-    <w:p>
-      <w:pPr>
-        <w:pStyle w:val="ListParagraph"/>
-        <w:numPr>
-          <w:ilvl w:val="0"/>
-          <w:numId w:val="2"/>
-        </w:numPr>
-        <w:spacing w:before="12" w:line="235" w:lineRule="exact"/>
-      </w:pPr>
-      <w:r>
-        <w:rPr>
-          <w:rFonts w:ascii="Times New Roman" w:cs="Times New Roman" w:eastAsia="Times New Roman" w:hAnsi="Times New Roman"/>
-          <w:sz w:val="20"/>
-          <w:szCs w:val="20"/>
-        </w:rPr>
-        <w:t xml:space="preserve">Built internal admin and secure-query tooling in JavaScript and Rails via Retool, saving roughly 250 engineering hours a month.</w:t>
+          <w:b/>
+          <w:bCs/>
+          <w:sz w:val="20"/>
+          <w:szCs w:val="20"/>
+        </w:rPr>
+        <w:t xml:space="preserve">Graduate Lead</w:t>
+      </w:r>
+      <w:r>
+        <w:rPr>
+          <w:rFonts w:ascii="Times New Roman" w:cs="Times New Roman" w:eastAsia="Times New Roman" w:hAnsi="Times New Roman"/>
+          <w:sz w:val="20"/>
+          <w:szCs w:val="20"/>
+        </w:rPr>
+        <w:t xml:space="preserve">, Columbia Quantum Algorithms Reading Group: weekly sessions through all 33 chapters of Andrew Childs' notes.</w:t>
       </w:r>
     </w:p>
     <w:p>
@@ -1343,151 +1514,6 @@
           <w:sz w:val="21"/>
           <w:szCs w:val="21"/>
         </w:rPr>
-        <w:t xml:space="preserve">COMPETITIONS &amp; LEADERSHIP</w:t>
-      </w:r>
-    </w:p>
-    <w:p>
-      <w:pPr>
-        <w:pStyle w:val="ListParagraph"/>
-        <w:numPr>
-          <w:ilvl w:val="0"/>
-          <w:numId w:val="2"/>
-        </w:numPr>
-        <w:spacing w:before="12" w:line="235" w:lineRule="exact"/>
-      </w:pPr>
-      <w:r>
-        <w:rPr>
-          <w:rFonts w:ascii="Times New Roman" w:cs="Times New Roman" w:eastAsia="Times New Roman" w:hAnsi="Times New Roman"/>
-          <w:b/>
-          <w:bCs/>
-          <w:sz w:val="20"/>
-          <w:szCs w:val="20"/>
-        </w:rPr>
-        <w:t xml:space="preserve">Overall Winner</w:t>
-      </w:r>
-      <w:r>
-        <w:rPr>
-          <w:rFonts w:ascii="Times New Roman" w:cs="Times New Roman" w:eastAsia="Times New Roman" w:hAnsi="Times New Roman"/>
-          <w:sz w:val="20"/>
-          <w:szCs w:val="20"/>
-        </w:rPr>
-        <w:t xml:space="preserve"> &amp; </w:t>
-      </w:r>
-      <w:r>
-        <w:rPr>
-          <w:rFonts w:ascii="Times New Roman" w:cs="Times New Roman" w:eastAsia="Times New Roman" w:hAnsi="Times New Roman"/>
-          <w:b/>
-          <w:bCs/>
-          <w:sz w:val="20"/>
-          <w:szCs w:val="20"/>
-        </w:rPr>
-        <w:t xml:space="preserve">NVIDIA Ecosystem Award</w:t>
-      </w:r>
-      <w:r>
-        <w:rPr>
-          <w:rFonts w:ascii="Times New Roman" w:cs="Times New Roman" w:eastAsia="Times New Roman" w:hAnsi="Times New Roman"/>
-          <w:sz w:val="20"/>
-          <w:szCs w:val="20"/>
-        </w:rPr>
-        <w:t xml:space="preserve">, MIT iQuHACK 2026, qualified for the NYU Abu Dhabi Quantum and AI Hackathon 2027</w:t>
-      </w:r>
-      <w:r>
-        <w:rPr>
-          <w:rFonts w:ascii="Times New Roman" w:cs="Times New Roman" w:eastAsia="Times New Roman" w:hAnsi="Times New Roman"/>
-          <w:sz w:val="20"/>
-          <w:szCs w:val="20"/>
-        </w:rPr>
-        <w:t xml:space="preserve"> · </w:t>
-      </w:r>
-      <w:r>
-        <w:rPr>
-          <w:rFonts w:ascii="Times New Roman" w:cs="Times New Roman" w:eastAsia="Times New Roman" w:hAnsi="Times New Roman"/>
-          <w:b/>
-          <w:bCs/>
-          <w:sz w:val="20"/>
-          <w:szCs w:val="20"/>
-        </w:rPr>
-        <w:t xml:space="preserve">Audience Favorite</w:t>
-      </w:r>
-      <w:r>
-        <w:rPr>
-          <w:rFonts w:ascii="Times New Roman" w:cs="Times New Roman" w:eastAsia="Times New Roman" w:hAnsi="Times New Roman"/>
-          <w:sz w:val="20"/>
-          <w:szCs w:val="20"/>
-        </w:rPr>
-        <w:t xml:space="preserve">, Harmoniqs Quantum Design 2026</w:t>
-      </w:r>
-      <w:r>
-        <w:rPr>
-          <w:rFonts w:ascii="Times New Roman" w:cs="Times New Roman" w:eastAsia="Times New Roman" w:hAnsi="Times New Roman"/>
-          <w:sz w:val="20"/>
-          <w:szCs w:val="20"/>
-        </w:rPr>
-        <w:t xml:space="preserve"> · </w:t>
-      </w:r>
-      <w:r>
-        <w:rPr>
-          <w:rFonts w:ascii="Times New Roman" w:cs="Times New Roman" w:eastAsia="Times New Roman" w:hAnsi="Times New Roman"/>
-          <w:b/>
-          <w:bCs/>
-          <w:sz w:val="20"/>
-          <w:szCs w:val="20"/>
-        </w:rPr>
-        <w:t xml:space="preserve">Runner-Up</w:t>
-      </w:r>
-      <w:r>
-        <w:rPr>
-          <w:rFonts w:ascii="Times New Roman" w:cs="Times New Roman" w:eastAsia="Times New Roman" w:hAnsi="Times New Roman"/>
-          <w:sz w:val="20"/>
-          <w:szCs w:val="20"/>
-        </w:rPr>
-        <w:t xml:space="preserve">, Qualcomm Snapdragon Hackathon 2026</w:t>
-      </w:r>
-    </w:p>
-    <w:p>
-      <w:pPr>
-        <w:pStyle w:val="ListParagraph"/>
-        <w:numPr>
-          <w:ilvl w:val="0"/>
-          <w:numId w:val="2"/>
-        </w:numPr>
-        <w:spacing w:before="12" w:line="235" w:lineRule="exact"/>
-      </w:pPr>
-      <w:r>
-        <w:rPr>
-          <w:rFonts w:ascii="Times New Roman" w:cs="Times New Roman" w:eastAsia="Times New Roman" w:hAnsi="Times New Roman"/>
-          <w:b/>
-          <w:bCs/>
-          <w:sz w:val="20"/>
-          <w:szCs w:val="20"/>
-        </w:rPr>
-        <w:t xml:space="preserve">Graduate Lead</w:t>
-      </w:r>
-      <w:r>
-        <w:rPr>
-          <w:rFonts w:ascii="Times New Roman" w:cs="Times New Roman" w:eastAsia="Times New Roman" w:hAnsi="Times New Roman"/>
-          <w:sz w:val="20"/>
-          <w:szCs w:val="20"/>
-        </w:rPr>
-        <w:t xml:space="preserve">, Columbia Quantum Algorithms Reading Group: weekly sessions through all 33 chapters of Andrew Childs' notes.</w:t>
-      </w:r>
-    </w:p>
-    <w:p>
-      <w:pPr>
-        <w:pBdr>
-          <w:bottom w:val="single" w:color="000000" w:sz="6" w:space="1"/>
-        </w:pBdr>
-        <w:spacing w:after="16" w:before="100" w:line="235" w:lineRule="exact"/>
-      </w:pPr>
-      <w:r>
-        <w:rPr>
-          <w:rFonts w:ascii="Times New Roman" w:cs="Times New Roman" w:eastAsia="Times New Roman" w:hAnsi="Times New Roman"/>
-          <w:b/>
-          <w:bCs/>
-          <w:spacing w:val="16"/>
-          <w:sz w:val="21"/>
-          <w:szCs w:val="21"/>
-        </w:rPr>
         <w:t xml:space="preserve">SKILLS</w:t>
       </w:r>
     </w:p>
@@ -1536,7 +1562,7 @@
           <w:sz w:val="20"/>
           <w:szCs w:val="20"/>
         </w:rPr>
-        <w:t xml:space="preserve">Hamiltonian simulation, phase and amplitude estimation, QSVT and block encoding, VQE, QAOA · surface codes, stabilizer formalism, MWPM and Union-Find decoding, threshold estimation, noise modeling</w:t>
+        <w:t xml:space="preserve">Hamiltonian simulation, phase and amplitude estimation, QSVT and block encoding, VQE, QAOA · surface codes, stabilizer formalism, MWPM and Union-Find decoding, threshold estimation, noise modeling, lattice surgery</w:t>
       </w:r>
     </w:p>
     <w:p>

</xml_diff>